<commit_message>
Added documentation for TSW ICMm
</commit_message>
<xml_diff>
--- a/profiles/documentation/tsw_ns_icmm_dtg_thejag.docx
+++ b/profiles/documentation/tsw_ns_icmm_dtg_thejag.docx
@@ -486,79 +486,146 @@
             </w:pPr>
             <w:r>
               <w:rPr>
-                <w:rFonts w:asciiTheme="majorHAnsi" w:hAnsiTheme="majorHAnsi"/>
-                <w:b/>
-                <w:bCs/>
                 <w:noProof/>
                 <w:color w:val="FFFFFF" w:themeColor="background1"/>
-                <w:sz w:val="36"/>
-                <w:szCs w:val="36"/>
+                <w:sz w:val="32"/>
+                <w:szCs w:val="32"/>
               </w:rPr>
               <mc:AlternateContent>
-                <mc:Choice Requires="wps">
+                <mc:Choice Requires="wpg">
                   <w:drawing>
-                    <wp:anchor distT="45720" distB="45720" distL="114300" distR="114300" simplePos="0" relativeHeight="251724800" behindDoc="0" locked="0" layoutInCell="1" allowOverlap="1" wp14:anchorId="7ECFFEE8" wp14:editId="0E40CAD4">
+                    <wp:anchor distT="0" distB="0" distL="114300" distR="114300" simplePos="0" relativeHeight="251724800" behindDoc="0" locked="0" layoutInCell="1" allowOverlap="1" wp14:anchorId="06CE9835" wp14:editId="57CEAE76">
                       <wp:simplePos x="0" y="0"/>
                       <wp:positionH relativeFrom="column">
-                        <wp:posOffset>1415219</wp:posOffset>
+                        <wp:posOffset>1291106</wp:posOffset>
                       </wp:positionH>
                       <wp:positionV relativeFrom="paragraph">
-                        <wp:posOffset>4572635</wp:posOffset>
+                        <wp:posOffset>4803564</wp:posOffset>
                       </wp:positionV>
-                      <wp:extent cx="271145" cy="285750"/>
+                      <wp:extent cx="232323" cy="199560"/>
                       <wp:effectExtent l="0" t="0" r="0" b="0"/>
                       <wp:wrapNone/>
-                      <wp:docPr id="1807397351" name="Text Box 2"/>
-                      <wp:cNvGraphicFramePr>
-                        <a:graphicFrameLocks xmlns:a="http://schemas.openxmlformats.org/drawingml/2006/main"/>
-                      </wp:cNvGraphicFramePr>
+                      <wp:docPr id="1277964484" name="Group 1"/>
+                      <wp:cNvGraphicFramePr/>
                       <a:graphic xmlns:a="http://schemas.openxmlformats.org/drawingml/2006/main">
-                        <a:graphicData uri="http://schemas.microsoft.com/office/word/2010/wordprocessingShape">
-                          <wps:wsp>
-                            <wps:cNvSpPr txBox="1">
-                              <a:spLocks noChangeArrowheads="1"/>
-                            </wps:cNvSpPr>
-                            <wps:spPr bwMode="auto">
+                        <a:graphicData uri="http://schemas.microsoft.com/office/word/2010/wordprocessingGroup">
+                          <wpg:wgp>
+                            <wpg:cNvGrpSpPr/>
+                            <wpg:grpSpPr>
                               <a:xfrm>
                                 <a:off x="0" y="0"/>
-                                <a:ext cx="271145" cy="285750"/>
+                                <a:ext cx="232323" cy="199560"/>
+                                <a:chOff x="-68515" y="232329"/>
+                                <a:chExt cx="232323" cy="199560"/>
                               </a:xfrm>
-                              <a:prstGeom prst="rect">
-                                <a:avLst/>
-                              </a:prstGeom>
-                              <a:noFill/>
-                              <a:ln w="9525">
+                            </wpg:grpSpPr>
+                            <wps:wsp>
+                              <wps:cNvPr id="115945447" name="Oval 1"/>
+                              <wps:cNvSpPr/>
+                              <wps:spPr>
+                                <a:xfrm>
+                                  <a:off x="0" y="288915"/>
+                                  <a:ext cx="95250" cy="95250"/>
+                                </a:xfrm>
+                                <a:prstGeom prst="ellipse">
+                                  <a:avLst/>
+                                </a:prstGeom>
+                                <a:solidFill>
+                                  <a:srgbClr val="00B050"/>
+                                </a:solidFill>
+                                <a:ln w="9525">
+                                  <a:solidFill>
+                                    <a:schemeClr val="bg1"/>
+                                  </a:solidFill>
+                                </a:ln>
+                              </wps:spPr>
+                              <wps:style>
+                                <a:lnRef idx="2">
+                                  <a:schemeClr val="accent6">
+                                    <a:shade val="15000"/>
+                                  </a:schemeClr>
+                                </a:lnRef>
+                                <a:fillRef idx="1">
+                                  <a:schemeClr val="accent6"/>
+                                </a:fillRef>
+                                <a:effectRef idx="0">
+                                  <a:schemeClr val="accent6"/>
+                                </a:effectRef>
+                                <a:fontRef idx="minor">
+                                  <a:schemeClr val="lt1"/>
+                                </a:fontRef>
+                              </wps:style>
+                              <wps:txbx>
+                                <w:txbxContent>
+                                  <w:p>
+                                    <w:pPr>
+                                      <w:rPr>
+                                        <w:color w:val="FFFFFF" w:themeColor="background1"/>
+                                      </w:rPr>
+                                    </w:pPr>
+                                    <w:r>
+                                      <w:rPr>
+                                        <w:color w:val="FFFFFF" w:themeColor="background1"/>
+                                      </w:rPr>
+                                      <w:t>2</w:t>
+                                    </w:r>
+                                  </w:p>
+                                </w:txbxContent>
+                              </wps:txbx>
+                              <wps:bodyPr rot="0" spcFirstLastPara="0" vertOverflow="overflow" horzOverflow="overflow" vert="horz" wrap="square" lIns="91440" tIns="45720" rIns="91440" bIns="45720" numCol="1" spcCol="0" rtlCol="0" fromWordArt="0" anchor="ctr" anchorCtr="0" forceAA="0" compatLnSpc="1">
+                                <a:prstTxWarp prst="textNoShape">
+                                  <a:avLst/>
+                                </a:prstTxWarp>
+                                <a:noAutofit/>
+                              </wps:bodyPr>
+                            </wps:wsp>
+                            <wps:wsp>
+                              <wps:cNvPr id="1807397351" name="Text Box 2"/>
+                              <wps:cNvSpPr txBox="1">
+                                <a:spLocks noChangeArrowheads="1"/>
+                              </wps:cNvSpPr>
+                              <wps:spPr bwMode="auto">
+                                <a:xfrm>
+                                  <a:off x="-68515" y="232329"/>
+                                  <a:ext cx="232323" cy="199560"/>
+                                </a:xfrm>
+                                <a:prstGeom prst="rect">
+                                  <a:avLst/>
+                                </a:prstGeom>
                                 <a:noFill/>
-                                <a:miter lim="800000"/>
-                                <a:headEnd/>
-                                <a:tailEnd/>
-                              </a:ln>
-                            </wps:spPr>
-                            <wps:txbx>
-                              <w:txbxContent>
-                                <w:p>
-                                  <w:pPr>
-                                    <w:rPr>
-                                      <w:color w:val="FFFFFF" w:themeColor="background1"/>
-                                      <w:sz w:val="14"/>
-                                      <w:szCs w:val="14"/>
-                                    </w:rPr>
-                                  </w:pPr>
-                                  <w:r>
-                                    <w:rPr>
-                                      <w:color w:val="FFFFFF" w:themeColor="background1"/>
-                                      <w:sz w:val="14"/>
-                                      <w:szCs w:val="14"/>
-                                    </w:rPr>
-                                    <w:t>2</w:t>
-                                  </w:r>
-                                </w:p>
-                              </w:txbxContent>
-                            </wps:txbx>
-                            <wps:bodyPr rot="0" vert="horz" wrap="square" lIns="91440" tIns="45720" rIns="91440" bIns="45720" anchor="t" anchorCtr="0">
-                              <a:noAutofit/>
-                            </wps:bodyPr>
-                          </wps:wsp>
+                                <a:ln w="9525">
+                                  <a:noFill/>
+                                  <a:miter lim="800000"/>
+                                  <a:headEnd/>
+                                  <a:tailEnd/>
+                                </a:ln>
+                              </wps:spPr>
+                              <wps:txbx>
+                                <w:txbxContent>
+                                  <w:p>
+                                    <w:pPr>
+                                      <w:rPr>
+                                        <w:color w:val="FFFFFF" w:themeColor="background1"/>
+                                        <w:sz w:val="14"/>
+                                        <w:szCs w:val="14"/>
+                                      </w:rPr>
+                                    </w:pPr>
+                                    <w:r>
+                                      <w:rPr>
+                                        <w:color w:val="FFFFFF" w:themeColor="background1"/>
+                                        <w:sz w:val="14"/>
+                                        <w:szCs w:val="14"/>
+                                      </w:rPr>
+                                      <w:t>0</w:t>
+                                    </w:r>
+                                  </w:p>
+                                </w:txbxContent>
+                              </wps:txbx>
+                              <wps:bodyPr rot="0" vert="horz" wrap="square" lIns="91440" tIns="45720" rIns="91440" bIns="45720" anchor="t" anchorCtr="0">
+                                <a:noAutofit/>
+                              </wps:bodyPr>
+                            </wps:wsp>
+                          </wpg:wgp>
                         </a:graphicData>
                       </a:graphic>
                       <wp14:sizeRelH relativeFrom="margin">
@@ -572,33 +639,55 @@
                 </mc:Choice>
                 <mc:Fallback>
                   <w:pict>
-                    <v:shapetype w14:anchorId="7ECFFEE8" id="_x0000_t202" coordsize="21600,21600" o:spt="202" path="m,l,21600r21600,l21600,xe">
-                      <v:stroke joinstyle="miter"/>
-                      <v:path gradientshapeok="t" o:connecttype="rect"/>
-                    </v:shapetype>
-                    <v:shape id="Text Box 2" o:spid="_x0000_s1026" type="#_x0000_t202" style="position:absolute;left:0;text-align:left;margin-left:111.45pt;margin-top:360.05pt;width:21.35pt;height:22.5pt;z-index:251724800;visibility:visible;mso-wrap-style:square;mso-width-percent:0;mso-height-percent:0;mso-wrap-distance-left:9pt;mso-wrap-distance-top:3.6pt;mso-wrap-distance-right:9pt;mso-wrap-distance-bottom:3.6pt;mso-position-horizontal:absolute;mso-position-horizontal-relative:text;mso-position-vertical:absolute;mso-position-vertical-relative:text;mso-width-percent:0;mso-height-percent:0;mso-width-relative:margin;mso-height-relative:margin;v-text-anchor:top" o:gfxdata="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" filled="f" stroked="f">
-                      <v:textbox>
-                        <w:txbxContent>
-                          <w:p>
-                            <w:pPr>
-                              <w:rPr>
-                                <w:color w:val="FFFFFF" w:themeColor="background1"/>
-                                <w:sz w:val="14"/>
-                                <w:szCs w:val="14"/>
-                              </w:rPr>
-                            </w:pPr>
-                            <w:r>
-                              <w:rPr>
-                                <w:color w:val="FFFFFF" w:themeColor="background1"/>
-                                <w:sz w:val="14"/>
-                                <w:szCs w:val="14"/>
-                              </w:rPr>
-                              <w:t>2</w:t>
-                            </w:r>
-                          </w:p>
-                        </w:txbxContent>
-                      </v:textbox>
-                    </v:shape>
+                    <v:group w14:anchorId="06CE9835" id="Group 1" o:spid="_x0000_s1026" style="position:absolute;left:0;text-align:left;margin-left:101.65pt;margin-top:378.25pt;width:18.3pt;height:15.7pt;z-index:251724800;mso-width-relative:margin;mso-height-relative:margin" coordorigin="-68515,232329" coordsize="232323,199560" o:gfxdata="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">
+                      <v:oval id="Oval 1" o:spid="_x0000_s1027" style="position:absolute;top:288915;width:95250;height:95250;visibility:visible;mso-wrap-style:square;v-text-anchor:middle" o:gfxdata="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" fillcolor="#00b050" strokecolor="white [3212]">
+                        <v:stroke joinstyle="miter"/>
+                        <v:textbox>
+                          <w:txbxContent>
+                            <w:p>
+                              <w:pPr>
+                                <w:rPr>
+                                  <w:color w:val="FFFFFF" w:themeColor="background1"/>
+                                </w:rPr>
+                              </w:pPr>
+                              <w:r>
+                                <w:rPr>
+                                  <w:color w:val="FFFFFF" w:themeColor="background1"/>
+                                </w:rPr>
+                                <w:t>2</w:t>
+                              </w:r>
+                            </w:p>
+                          </w:txbxContent>
+                        </v:textbox>
+                      </v:oval>
+                      <v:shapetype id="_x0000_t202" coordsize="21600,21600" o:spt="202" path="m,l,21600r21600,l21600,xe">
+                        <v:stroke joinstyle="miter"/>
+                        <v:path gradientshapeok="t" o:connecttype="rect"/>
+                      </v:shapetype>
+                      <v:shape id="Text Box 2" o:spid="_x0000_s1028" type="#_x0000_t202" style="position:absolute;left:-68515;top:232329;width:232323;height:199560;visibility:visible;mso-wrap-style:square;v-text-anchor:top" o:gfxdata="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" filled="f" stroked="f">
+                        <v:textbox>
+                          <w:txbxContent>
+                            <w:p>
+                              <w:pPr>
+                                <w:rPr>
+                                  <w:color w:val="FFFFFF" w:themeColor="background1"/>
+                                  <w:sz w:val="14"/>
+                                  <w:szCs w:val="14"/>
+                                </w:rPr>
+                              </w:pPr>
+                              <w:r>
+                                <w:rPr>
+                                  <w:color w:val="FFFFFF" w:themeColor="background1"/>
+                                  <w:sz w:val="14"/>
+                                  <w:szCs w:val="14"/>
+                                </w:rPr>
+                                <w:t>0</w:t>
+                              </w:r>
+                            </w:p>
+                          </w:txbxContent>
+                        </v:textbox>
+                      </v:shape>
+                    </v:group>
                   </w:pict>
                 </mc:Fallback>
               </mc:AlternateContent>
@@ -613,792 +702,7 @@
               <mc:AlternateContent>
                 <mc:Choice Requires="wps">
                   <w:drawing>
-                    <wp:anchor distT="0" distB="0" distL="114300" distR="114300" simplePos="0" relativeHeight="251760640" behindDoc="0" locked="0" layoutInCell="1" allowOverlap="1" wp14:anchorId="37277F15" wp14:editId="49F9417F">
-                      <wp:simplePos x="0" y="0"/>
-                      <wp:positionH relativeFrom="column">
-                        <wp:posOffset>-398284</wp:posOffset>
-                      </wp:positionH>
-                      <wp:positionV relativeFrom="paragraph">
-                        <wp:posOffset>4230182</wp:posOffset>
-                      </wp:positionV>
-                      <wp:extent cx="1504081" cy="877851"/>
-                      <wp:effectExtent l="0" t="0" r="20320" b="17780"/>
-                      <wp:wrapNone/>
-                      <wp:docPr id="720524358" name="Rectangle 1"/>
-                      <wp:cNvGraphicFramePr/>
-                      <a:graphic xmlns:a="http://schemas.openxmlformats.org/drawingml/2006/main">
-                        <a:graphicData uri="http://schemas.microsoft.com/office/word/2010/wordprocessingShape">
-                          <wps:wsp>
-                            <wps:cNvSpPr/>
-                            <wps:spPr>
-                              <a:xfrm>
-                                <a:off x="0" y="0"/>
-                                <a:ext cx="1504081" cy="877851"/>
-                              </a:xfrm>
-                              <a:prstGeom prst="rect">
-                                <a:avLst/>
-                              </a:prstGeom>
-                              <a:solidFill>
-                                <a:srgbClr val="000000">
-                                  <a:alpha val="60000"/>
-                                </a:srgbClr>
-                              </a:solidFill>
-                              <a:ln w="12700">
-                                <a:solidFill>
-                                  <a:srgbClr val="FF0000"/>
-                                </a:solidFill>
-                              </a:ln>
-                            </wps:spPr>
-                            <wps:style>
-                              <a:lnRef idx="2">
-                                <a:schemeClr val="accent1">
-                                  <a:shade val="15000"/>
-                                </a:schemeClr>
-                              </a:lnRef>
-                              <a:fillRef idx="1">
-                                <a:schemeClr val="accent1"/>
-                              </a:fillRef>
-                              <a:effectRef idx="0">
-                                <a:schemeClr val="accent1"/>
-                              </a:effectRef>
-                              <a:fontRef idx="minor">
-                                <a:schemeClr val="lt1"/>
-                              </a:fontRef>
-                            </wps:style>
-                            <wps:txbx>
-                              <w:txbxContent>
-                                <w:p>
-                                  <w:pPr>
-                                    <w:spacing w:after="0" w:line="180" w:lineRule="auto"/>
-                                    <w:rPr>
-                                      <w:b/>
-                                      <w:bCs/>
-                                      <w:color w:val="FF0000"/>
-                                      <w:sz w:val="20"/>
-                                      <w:szCs w:val="20"/>
-                                      <w14:shadow w14:blurRad="50800" w14:dist="38100" w14:dir="2700000" w14:sx="100000" w14:sy="100000" w14:kx="0" w14:ky="0" w14:algn="tl">
-                                        <w14:srgbClr w14:val="000000">
-                                          <w14:alpha w14:val="60000"/>
-                                        </w14:srgbClr>
-                                      </w14:shadow>
-                                    </w:rPr>
-                                  </w:pPr>
-                                  <w:r>
-                                    <w:rPr>
-                                      <w:b/>
-                                      <w:bCs/>
-                                      <w:color w:val="FF0000"/>
-                                      <w:sz w:val="20"/>
-                                      <w:szCs w:val="20"/>
-                                      <w14:shadow w14:blurRad="50800" w14:dist="38100" w14:dir="2700000" w14:sx="100000" w14:sy="100000" w14:kx="0" w14:ky="0" w14:algn="tl">
-                                        <w14:srgbClr w14:val="000000">
-                                          <w14:alpha w14:val="60000"/>
-                                        </w14:srgbClr>
-                                      </w14:shadow>
-                                    </w:rPr>
-                                    <w:t xml:space="preserve">   0:</w:t>
-                                  </w:r>
-                                  <w:r>
-                                    <w:rPr>
-                                      <w:b/>
-                                      <w:bCs/>
-                                      <w:color w:val="FF0000"/>
-                                      <w:sz w:val="20"/>
-                                      <w:szCs w:val="20"/>
-                                      <w14:shadow w14:blurRad="50800" w14:dist="38100" w14:dir="2700000" w14:sx="100000" w14:sy="100000" w14:kx="0" w14:ky="0" w14:algn="tl">
-                                        <w14:srgbClr w14:val="000000">
-                                          <w14:alpha w14:val="60000"/>
-                                        </w14:srgbClr>
-                                      </w14:shadow>
-                                    </w:rPr>
-                                    <w:tab/>
-                                  </w:r>
-                                  <w:r>
-                                    <w:rPr>
-                                      <w:b/>
-                                      <w:bCs/>
-                                      <w:color w:val="FF0000"/>
-                                      <w:sz w:val="20"/>
-                                      <w:szCs w:val="20"/>
-                                      <w14:shadow w14:blurRad="50800" w14:dist="38100" w14:dir="2700000" w14:sx="100000" w14:sy="100000" w14:kx="0" w14:ky="0" w14:algn="tl">
-                                        <w14:srgbClr w14:val="000000">
-                                          <w14:alpha w14:val="60000"/>
-                                        </w14:srgbClr>
-                                      </w14:shadow>
-                                    </w:rPr>
-                                    <w:t>-</w:t>
-                                  </w:r>
-                                  <w:r>
-                                    <w:rPr>
-                                      <w:b/>
-                                      <w:bCs/>
-                                      <w:color w:val="FF0000"/>
-                                      <w:sz w:val="20"/>
-                                      <w:szCs w:val="20"/>
-                                      <w14:shadow w14:blurRad="50800" w14:dist="38100" w14:dir="2700000" w14:sx="100000" w14:sy="100000" w14:kx="0" w14:ky="0" w14:algn="tl">
-                                        <w14:srgbClr w14:val="000000">
-                                          <w14:alpha w14:val="60000"/>
-                                        </w14:srgbClr>
-                                      </w14:shadow>
-                                    </w:rPr>
-                                    <w:br/>
-                                    <w:t xml:space="preserve">  BTV: </w:t>
-                                  </w:r>
-                                  <w:r>
-                                    <w:rPr>
-                                      <w:b/>
-                                      <w:bCs/>
-                                      <w:color w:val="FF0000"/>
-                                      <w:sz w:val="20"/>
-                                      <w:szCs w:val="20"/>
-                                      <w14:shadow w14:blurRad="50800" w14:dist="38100" w14:dir="2700000" w14:sx="100000" w14:sy="100000" w14:kx="0" w14:ky="0" w14:algn="tl">
-                                        <w14:srgbClr w14:val="000000">
-                                          <w14:alpha w14:val="60000"/>
-                                        </w14:srgbClr>
-                                      </w14:shadow>
-                                    </w:rPr>
-                                    <w:tab/>
-                                  </w:r>
-                                  <w:r>
-                                    <w:rPr>
-                                      <w:b/>
-                                      <w:bCs/>
-                                      <w:color w:val="FF0000"/>
-                                      <w:sz w:val="20"/>
-                                      <w:szCs w:val="20"/>
-                                      <w14:shadow w14:blurRad="50800" w14:dist="38100" w14:dir="2700000" w14:sx="100000" w14:sy="100000" w14:kx="0" w14:ky="0" w14:algn="tl">
-                                        <w14:srgbClr w14:val="000000">
-                                          <w14:alpha w14:val="60000"/>
-                                        </w14:srgbClr>
-                                      </w14:shadow>
-                                    </w:rPr>
-                                    <w:t>Off</w:t>
-                                  </w:r>
-                                  <w:r>
-                                    <w:rPr>
-                                      <w:b/>
-                                      <w:bCs/>
-                                      <w:color w:val="FF0000"/>
-                                      <w:sz w:val="20"/>
-                                      <w:szCs w:val="20"/>
-                                      <w14:shadow w14:blurRad="50800" w14:dist="38100" w14:dir="2700000" w14:sx="100000" w14:sy="100000" w14:kx="0" w14:ky="0" w14:algn="tl">
-                                        <w14:srgbClr w14:val="000000">
-                                          <w14:alpha w14:val="60000"/>
-                                        </w14:srgbClr>
-                                      </w14:shadow>
-                                    </w:rPr>
-                                    <w:br/>
-                                    <w:t xml:space="preserve">  LO: </w:t>
-                                  </w:r>
-                                  <w:r>
-                                    <w:rPr>
-                                      <w:b/>
-                                      <w:bCs/>
-                                      <w:color w:val="FF0000"/>
-                                      <w:sz w:val="20"/>
-                                      <w:szCs w:val="20"/>
-                                      <w14:shadow w14:blurRad="50800" w14:dist="38100" w14:dir="2700000" w14:sx="100000" w14:sy="100000" w14:kx="0" w14:ky="0" w14:algn="tl">
-                                        <w14:srgbClr w14:val="000000">
-                                          <w14:alpha w14:val="60000"/>
-                                        </w14:srgbClr>
-                                      </w14:shadow>
-                                    </w:rPr>
-                                    <w:tab/>
-                                  </w:r>
-                                  <w:r>
-                                    <w:rPr>
-                                      <w:b/>
-                                      <w:bCs/>
-                                      <w:color w:val="FF0000"/>
-                                      <w:sz w:val="20"/>
-                                      <w:szCs w:val="20"/>
-                                      <w14:shadow w14:blurRad="50800" w14:dist="38100" w14:dir="2700000" w14:sx="100000" w14:sy="100000" w14:kx="0" w14:ky="0" w14:algn="tl">
-                                        <w14:srgbClr w14:val="000000">
-                                          <w14:alpha w14:val="60000"/>
-                                        </w14:srgbClr>
-                                      </w14:shadow>
-                                    </w:rPr>
-                                    <w:t>Shunting (C)</w:t>
-                                  </w:r>
-                                  <w:r>
-                                    <w:rPr>
-                                      <w:b/>
-                                      <w:bCs/>
-                                      <w:color w:val="FF0000"/>
-                                      <w:sz w:val="20"/>
-                                      <w:szCs w:val="20"/>
-                                      <w14:shadow w14:blurRad="50800" w14:dist="38100" w14:dir="2700000" w14:sx="100000" w14:sy="100000" w14:kx="0" w14:ky="0" w14:algn="tl">
-                                        <w14:srgbClr w14:val="000000">
-                                          <w14:alpha w14:val="60000"/>
-                                        </w14:srgbClr>
-                                      </w14:shadow>
-                                    </w:rPr>
-                                    <w:t xml:space="preserve"> </w:t>
-                                  </w:r>
-                                  <w:r>
-                                    <w:rPr>
-                                      <w:b/>
-                                      <w:bCs/>
-                                      <w:color w:val="FF0000"/>
-                                      <w:sz w:val="20"/>
-                                      <w:szCs w:val="20"/>
-                                      <w14:shadow w14:blurRad="50800" w14:dist="38100" w14:dir="2700000" w14:sx="100000" w14:sy="100000" w14:kx="0" w14:ky="0" w14:algn="tl">
-                                        <w14:srgbClr w14:val="000000">
-                                          <w14:alpha w14:val="60000"/>
-                                        </w14:srgbClr>
-                                      </w14:shadow>
-                                    </w:rPr>
-                                    <w:br/>
-                                    <w:t xml:space="preserve">  2: </w:t>
-                                  </w:r>
-                                  <w:r>
-                                    <w:rPr>
-                                      <w:b/>
-                                      <w:bCs/>
-                                      <w:color w:val="FF0000"/>
-                                      <w:sz w:val="20"/>
-                                      <w:szCs w:val="20"/>
-                                      <w14:shadow w14:blurRad="50800" w14:dist="38100" w14:dir="2700000" w14:sx="100000" w14:sy="100000" w14:kx="0" w14:ky="0" w14:algn="tl">
-                                        <w14:srgbClr w14:val="000000">
-                                          <w14:alpha w14:val="60000"/>
-                                        </w14:srgbClr>
-                                      </w14:shadow>
-                                    </w:rPr>
-                                    <w:tab/>
-                                  </w:r>
-                                  <w:r>
-                                    <w:rPr>
-                                      <w:b/>
-                                      <w:bCs/>
-                                      <w:color w:val="FF0000"/>
-                                      <w:sz w:val="20"/>
-                                      <w:szCs w:val="20"/>
-                                      <w14:shadow w14:blurRad="50800" w14:dist="38100" w14:dir="2700000" w14:sx="100000" w14:sy="100000" w14:kx="0" w14:ky="0" w14:algn="tl">
-                                        <w14:srgbClr w14:val="000000">
-                                          <w14:alpha w14:val="60000"/>
-                                        </w14:srgbClr>
-                                      </w14:shadow>
-                                    </w:rPr>
-                                    <w:t>Head lights (LRC)</w:t>
-                                  </w:r>
-                                </w:p>
-                                <w:p>
-                                  <w:pPr>
-                                    <w:spacing w:after="0" w:line="180" w:lineRule="auto"/>
-                                    <w:rPr>
-                                      <w:b/>
-                                      <w:bCs/>
-                                      <w:color w:val="FF0000"/>
-                                      <w:sz w:val="20"/>
-                                      <w:szCs w:val="20"/>
-                                      <w14:shadow w14:blurRad="50800" w14:dist="38100" w14:dir="2700000" w14:sx="100000" w14:sy="100000" w14:kx="0" w14:ky="0" w14:algn="tl">
-                                        <w14:srgbClr w14:val="000000">
-                                          <w14:alpha w14:val="60000"/>
-                                        </w14:srgbClr>
-                                      </w14:shadow>
-                                    </w:rPr>
-                                  </w:pPr>
-                                  <w:r>
-                                    <w:rPr>
-                                      <w:b/>
-                                      <w:bCs/>
-                                      <w:color w:val="FF0000"/>
-                                      <w:sz w:val="20"/>
-                                      <w:szCs w:val="20"/>
-                                      <w14:shadow w14:blurRad="50800" w14:dist="38100" w14:dir="2700000" w14:sx="100000" w14:sy="100000" w14:kx="0" w14:ky="0" w14:algn="tl">
-                                        <w14:srgbClr w14:val="000000">
-                                          <w14:alpha w14:val="60000"/>
-                                        </w14:srgbClr>
-                                      </w14:shadow>
-                                    </w:rPr>
-                                    <w:t xml:space="preserve">  3: </w:t>
-                                  </w:r>
-                                  <w:r>
-                                    <w:rPr>
-                                      <w:b/>
-                                      <w:bCs/>
-                                      <w:color w:val="FF0000"/>
-                                      <w:sz w:val="20"/>
-                                      <w:szCs w:val="20"/>
-                                      <w14:shadow w14:blurRad="50800" w14:dist="38100" w14:dir="2700000" w14:sx="100000" w14:sy="100000" w14:kx="0" w14:ky="0" w14:algn="tl">
-                                        <w14:srgbClr w14:val="000000">
-                                          <w14:alpha w14:val="60000"/>
-                                        </w14:srgbClr>
-                                      </w14:shadow>
-                                    </w:rPr>
-                                    <w:tab/>
-                                  </w:r>
-                                  <w:proofErr w:type="gramStart"/>
-                                  <w:r>
-                                    <w:rPr>
-                                      <w:b/>
-                                      <w:bCs/>
-                                      <w:color w:val="FF0000"/>
-                                      <w:sz w:val="20"/>
-                                      <w:szCs w:val="20"/>
-                                      <w14:shadow w14:blurRad="50800" w14:dist="38100" w14:dir="2700000" w14:sx="100000" w14:sy="100000" w14:kx="0" w14:ky="0" w14:algn="tl">
-                                        <w14:srgbClr w14:val="000000">
-                                          <w14:alpha w14:val="60000"/>
-                                        </w14:srgbClr>
-                                      </w14:shadow>
-                                    </w:rPr>
-                                    <w:t>Tail lights</w:t>
-                                  </w:r>
-                                  <w:proofErr w:type="gramEnd"/>
-                                  <w:r>
-                                    <w:rPr>
-                                      <w:b/>
-                                      <w:bCs/>
-                                      <w:color w:val="FF0000"/>
-                                      <w:sz w:val="20"/>
-                                      <w:szCs w:val="20"/>
-                                      <w14:shadow w14:blurRad="50800" w14:dist="38100" w14:dir="2700000" w14:sx="100000" w14:sy="100000" w14:kx="0" w14:ky="0" w14:algn="tl">
-                                        <w14:srgbClr w14:val="000000">
-                                          <w14:alpha w14:val="60000"/>
-                                        </w14:srgbClr>
-                                      </w14:shadow>
-                                    </w:rPr>
-                                    <w:t xml:space="preserve"> (LR)</w:t>
-                                  </w:r>
-                                </w:p>
-                                <w:p>
-                                  <w:pPr>
-                                    <w:spacing w:after="0" w:line="180" w:lineRule="auto"/>
-                                  </w:pPr>
-                                  <w:r>
-                                    <w:rPr>
-                                      <w:b/>
-                                      <w:bCs/>
-                                      <w:color w:val="FF0000"/>
-                                      <w:sz w:val="20"/>
-                                      <w:szCs w:val="20"/>
-                                      <w14:shadow w14:blurRad="50800" w14:dist="38100" w14:dir="2700000" w14:sx="100000" w14:sy="100000" w14:kx="0" w14:ky="0" w14:algn="tl">
-                                        <w14:srgbClr w14:val="000000">
-                                          <w14:alpha w14:val="60000"/>
-                                        </w14:srgbClr>
-                                      </w14:shadow>
-                                    </w:rPr>
-                                    <w:t xml:space="preserve">  HI: </w:t>
-                                  </w:r>
-                                  <w:r>
-                                    <w:rPr>
-                                      <w:b/>
-                                      <w:bCs/>
-                                      <w:color w:val="FF0000"/>
-                                      <w:sz w:val="20"/>
-                                      <w:szCs w:val="20"/>
-                                      <w14:shadow w14:blurRad="50800" w14:dist="38100" w14:dir="2700000" w14:sx="100000" w14:sy="100000" w14:kx="0" w14:ky="0" w14:algn="tl">
-                                        <w14:srgbClr w14:val="000000">
-                                          <w14:alpha w14:val="60000"/>
-                                        </w14:srgbClr>
-                                      </w14:shadow>
-                                    </w:rPr>
-                                    <w:tab/>
-                                  </w:r>
-                                  <w:r>
-                                    <w:rPr>
-                                      <w:b/>
-                                      <w:bCs/>
-                                      <w:color w:val="FF0000"/>
-                                      <w:sz w:val="20"/>
-                                      <w:szCs w:val="20"/>
-                                      <w14:shadow w14:blurRad="50800" w14:dist="38100" w14:dir="2700000" w14:sx="100000" w14:sy="100000" w14:kx="0" w14:ky="0" w14:algn="tl">
-                                        <w14:srgbClr w14:val="000000">
-                                          <w14:alpha w14:val="60000"/>
-                                        </w14:srgbClr>
-                                      </w14:shadow>
-                                    </w:rPr>
-                                    <w:t>Emergency</w:t>
-                                  </w:r>
-                                </w:p>
-                              </w:txbxContent>
-                            </wps:txbx>
-                            <wps:bodyPr rot="0" spcFirstLastPara="0" vertOverflow="overflow" horzOverflow="overflow" vert="horz" wrap="square" lIns="0" tIns="0" rIns="0" bIns="0" numCol="1" spcCol="0" rtlCol="0" fromWordArt="0" anchor="ctr" anchorCtr="0" forceAA="0" compatLnSpc="1">
-                              <a:prstTxWarp prst="textNoShape">
-                                <a:avLst/>
-                              </a:prstTxWarp>
-                              <a:noAutofit/>
-                            </wps:bodyPr>
-                          </wps:wsp>
-                        </a:graphicData>
-                      </a:graphic>
-                      <wp14:sizeRelH relativeFrom="margin">
-                        <wp14:pctWidth>0</wp14:pctWidth>
-                      </wp14:sizeRelH>
-                      <wp14:sizeRelV relativeFrom="margin">
-                        <wp14:pctHeight>0</wp14:pctHeight>
-                      </wp14:sizeRelV>
-                    </wp:anchor>
-                  </w:drawing>
-                </mc:Choice>
-                <mc:Fallback>
-                  <w:pict>
-                    <v:rect w14:anchorId="37277F15" id="Rectangle 1" o:spid="_x0000_s1027" style="position:absolute;left:0;text-align:left;margin-left:-31.35pt;margin-top:333.1pt;width:118.45pt;height:69.1pt;z-index:251760640;visibility:visible;mso-wrap-style:square;mso-width-percent:0;mso-height-percent:0;mso-wrap-distance-left:9pt;mso-wrap-distance-top:0;mso-wrap-distance-right:9pt;mso-wrap-distance-bottom:0;mso-position-horizontal:absolute;mso-position-horizontal-relative:text;mso-position-vertical:absolute;mso-position-vertical-relative:text;mso-width-percent:0;mso-height-percent:0;mso-width-relative:margin;mso-height-relative:margin;v-text-anchor:middle" o:gfxdata="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" fillcolor="black" strokecolor="red" strokeweight="1pt">
-                      <v:fill opacity="39321f"/>
-                      <v:textbox inset="0,0,0,0">
-                        <w:txbxContent>
-                          <w:p>
-                            <w:pPr>
-                              <w:spacing w:after="0" w:line="180" w:lineRule="auto"/>
-                              <w:rPr>
-                                <w:b/>
-                                <w:bCs/>
-                                <w:color w:val="FF0000"/>
-                                <w:sz w:val="20"/>
-                                <w:szCs w:val="20"/>
-                                <w14:shadow w14:blurRad="50800" w14:dist="38100" w14:dir="2700000" w14:sx="100000" w14:sy="100000" w14:kx="0" w14:ky="0" w14:algn="tl">
-                                  <w14:srgbClr w14:val="000000">
-                                    <w14:alpha w14:val="60000"/>
-                                  </w14:srgbClr>
-                                </w14:shadow>
-                              </w:rPr>
-                            </w:pPr>
-                            <w:r>
-                              <w:rPr>
-                                <w:b/>
-                                <w:bCs/>
-                                <w:color w:val="FF0000"/>
-                                <w:sz w:val="20"/>
-                                <w:szCs w:val="20"/>
-                                <w14:shadow w14:blurRad="50800" w14:dist="38100" w14:dir="2700000" w14:sx="100000" w14:sy="100000" w14:kx="0" w14:ky="0" w14:algn="tl">
-                                  <w14:srgbClr w14:val="000000">
-                                    <w14:alpha w14:val="60000"/>
-                                  </w14:srgbClr>
-                                </w14:shadow>
-                              </w:rPr>
-                              <w:t xml:space="preserve">   0:</w:t>
-                            </w:r>
-                            <w:r>
-                              <w:rPr>
-                                <w:b/>
-                                <w:bCs/>
-                                <w:color w:val="FF0000"/>
-                                <w:sz w:val="20"/>
-                                <w:szCs w:val="20"/>
-                                <w14:shadow w14:blurRad="50800" w14:dist="38100" w14:dir="2700000" w14:sx="100000" w14:sy="100000" w14:kx="0" w14:ky="0" w14:algn="tl">
-                                  <w14:srgbClr w14:val="000000">
-                                    <w14:alpha w14:val="60000"/>
-                                  </w14:srgbClr>
-                                </w14:shadow>
-                              </w:rPr>
-                              <w:tab/>
-                            </w:r>
-                            <w:r>
-                              <w:rPr>
-                                <w:b/>
-                                <w:bCs/>
-                                <w:color w:val="FF0000"/>
-                                <w:sz w:val="20"/>
-                                <w:szCs w:val="20"/>
-                                <w14:shadow w14:blurRad="50800" w14:dist="38100" w14:dir="2700000" w14:sx="100000" w14:sy="100000" w14:kx="0" w14:ky="0" w14:algn="tl">
-                                  <w14:srgbClr w14:val="000000">
-                                    <w14:alpha w14:val="60000"/>
-                                  </w14:srgbClr>
-                                </w14:shadow>
-                              </w:rPr>
-                              <w:t>-</w:t>
-                            </w:r>
-                            <w:r>
-                              <w:rPr>
-                                <w:b/>
-                                <w:bCs/>
-                                <w:color w:val="FF0000"/>
-                                <w:sz w:val="20"/>
-                                <w:szCs w:val="20"/>
-                                <w14:shadow w14:blurRad="50800" w14:dist="38100" w14:dir="2700000" w14:sx="100000" w14:sy="100000" w14:kx="0" w14:ky="0" w14:algn="tl">
-                                  <w14:srgbClr w14:val="000000">
-                                    <w14:alpha w14:val="60000"/>
-                                  </w14:srgbClr>
-                                </w14:shadow>
-                              </w:rPr>
-                              <w:br/>
-                              <w:t xml:space="preserve">  BTV: </w:t>
-                            </w:r>
-                            <w:r>
-                              <w:rPr>
-                                <w:b/>
-                                <w:bCs/>
-                                <w:color w:val="FF0000"/>
-                                <w:sz w:val="20"/>
-                                <w:szCs w:val="20"/>
-                                <w14:shadow w14:blurRad="50800" w14:dist="38100" w14:dir="2700000" w14:sx="100000" w14:sy="100000" w14:kx="0" w14:ky="0" w14:algn="tl">
-                                  <w14:srgbClr w14:val="000000">
-                                    <w14:alpha w14:val="60000"/>
-                                  </w14:srgbClr>
-                                </w14:shadow>
-                              </w:rPr>
-                              <w:tab/>
-                            </w:r>
-                            <w:r>
-                              <w:rPr>
-                                <w:b/>
-                                <w:bCs/>
-                                <w:color w:val="FF0000"/>
-                                <w:sz w:val="20"/>
-                                <w:szCs w:val="20"/>
-                                <w14:shadow w14:blurRad="50800" w14:dist="38100" w14:dir="2700000" w14:sx="100000" w14:sy="100000" w14:kx="0" w14:ky="0" w14:algn="tl">
-                                  <w14:srgbClr w14:val="000000">
-                                    <w14:alpha w14:val="60000"/>
-                                  </w14:srgbClr>
-                                </w14:shadow>
-                              </w:rPr>
-                              <w:t>Off</w:t>
-                            </w:r>
-                            <w:r>
-                              <w:rPr>
-                                <w:b/>
-                                <w:bCs/>
-                                <w:color w:val="FF0000"/>
-                                <w:sz w:val="20"/>
-                                <w:szCs w:val="20"/>
-                                <w14:shadow w14:blurRad="50800" w14:dist="38100" w14:dir="2700000" w14:sx="100000" w14:sy="100000" w14:kx="0" w14:ky="0" w14:algn="tl">
-                                  <w14:srgbClr w14:val="000000">
-                                    <w14:alpha w14:val="60000"/>
-                                  </w14:srgbClr>
-                                </w14:shadow>
-                              </w:rPr>
-                              <w:br/>
-                              <w:t xml:space="preserve">  LO: </w:t>
-                            </w:r>
-                            <w:r>
-                              <w:rPr>
-                                <w:b/>
-                                <w:bCs/>
-                                <w:color w:val="FF0000"/>
-                                <w:sz w:val="20"/>
-                                <w:szCs w:val="20"/>
-                                <w14:shadow w14:blurRad="50800" w14:dist="38100" w14:dir="2700000" w14:sx="100000" w14:sy="100000" w14:kx="0" w14:ky="0" w14:algn="tl">
-                                  <w14:srgbClr w14:val="000000">
-                                    <w14:alpha w14:val="60000"/>
-                                  </w14:srgbClr>
-                                </w14:shadow>
-                              </w:rPr>
-                              <w:tab/>
-                            </w:r>
-                            <w:r>
-                              <w:rPr>
-                                <w:b/>
-                                <w:bCs/>
-                                <w:color w:val="FF0000"/>
-                                <w:sz w:val="20"/>
-                                <w:szCs w:val="20"/>
-                                <w14:shadow w14:blurRad="50800" w14:dist="38100" w14:dir="2700000" w14:sx="100000" w14:sy="100000" w14:kx="0" w14:ky="0" w14:algn="tl">
-                                  <w14:srgbClr w14:val="000000">
-                                    <w14:alpha w14:val="60000"/>
-                                  </w14:srgbClr>
-                                </w14:shadow>
-                              </w:rPr>
-                              <w:t>Shunting (C)</w:t>
-                            </w:r>
-                            <w:r>
-                              <w:rPr>
-                                <w:b/>
-                                <w:bCs/>
-                                <w:color w:val="FF0000"/>
-                                <w:sz w:val="20"/>
-                                <w:szCs w:val="20"/>
-                                <w14:shadow w14:blurRad="50800" w14:dist="38100" w14:dir="2700000" w14:sx="100000" w14:sy="100000" w14:kx="0" w14:ky="0" w14:algn="tl">
-                                  <w14:srgbClr w14:val="000000">
-                                    <w14:alpha w14:val="60000"/>
-                                  </w14:srgbClr>
-                                </w14:shadow>
-                              </w:rPr>
-                              <w:t xml:space="preserve"> </w:t>
-                            </w:r>
-                            <w:r>
-                              <w:rPr>
-                                <w:b/>
-                                <w:bCs/>
-                                <w:color w:val="FF0000"/>
-                                <w:sz w:val="20"/>
-                                <w:szCs w:val="20"/>
-                                <w14:shadow w14:blurRad="50800" w14:dist="38100" w14:dir="2700000" w14:sx="100000" w14:sy="100000" w14:kx="0" w14:ky="0" w14:algn="tl">
-                                  <w14:srgbClr w14:val="000000">
-                                    <w14:alpha w14:val="60000"/>
-                                  </w14:srgbClr>
-                                </w14:shadow>
-                              </w:rPr>
-                              <w:br/>
-                              <w:t xml:space="preserve">  2: </w:t>
-                            </w:r>
-                            <w:r>
-                              <w:rPr>
-                                <w:b/>
-                                <w:bCs/>
-                                <w:color w:val="FF0000"/>
-                                <w:sz w:val="20"/>
-                                <w:szCs w:val="20"/>
-                                <w14:shadow w14:blurRad="50800" w14:dist="38100" w14:dir="2700000" w14:sx="100000" w14:sy="100000" w14:kx="0" w14:ky="0" w14:algn="tl">
-                                  <w14:srgbClr w14:val="000000">
-                                    <w14:alpha w14:val="60000"/>
-                                  </w14:srgbClr>
-                                </w14:shadow>
-                              </w:rPr>
-                              <w:tab/>
-                            </w:r>
-                            <w:r>
-                              <w:rPr>
-                                <w:b/>
-                                <w:bCs/>
-                                <w:color w:val="FF0000"/>
-                                <w:sz w:val="20"/>
-                                <w:szCs w:val="20"/>
-                                <w14:shadow w14:blurRad="50800" w14:dist="38100" w14:dir="2700000" w14:sx="100000" w14:sy="100000" w14:kx="0" w14:ky="0" w14:algn="tl">
-                                  <w14:srgbClr w14:val="000000">
-                                    <w14:alpha w14:val="60000"/>
-                                  </w14:srgbClr>
-                                </w14:shadow>
-                              </w:rPr>
-                              <w:t>Head lights (LRC)</w:t>
-                            </w:r>
-                          </w:p>
-                          <w:p>
-                            <w:pPr>
-                              <w:spacing w:after="0" w:line="180" w:lineRule="auto"/>
-                              <w:rPr>
-                                <w:b/>
-                                <w:bCs/>
-                                <w:color w:val="FF0000"/>
-                                <w:sz w:val="20"/>
-                                <w:szCs w:val="20"/>
-                                <w14:shadow w14:blurRad="50800" w14:dist="38100" w14:dir="2700000" w14:sx="100000" w14:sy="100000" w14:kx="0" w14:ky="0" w14:algn="tl">
-                                  <w14:srgbClr w14:val="000000">
-                                    <w14:alpha w14:val="60000"/>
-                                  </w14:srgbClr>
-                                </w14:shadow>
-                              </w:rPr>
-                            </w:pPr>
-                            <w:r>
-                              <w:rPr>
-                                <w:b/>
-                                <w:bCs/>
-                                <w:color w:val="FF0000"/>
-                                <w:sz w:val="20"/>
-                                <w:szCs w:val="20"/>
-                                <w14:shadow w14:blurRad="50800" w14:dist="38100" w14:dir="2700000" w14:sx="100000" w14:sy="100000" w14:kx="0" w14:ky="0" w14:algn="tl">
-                                  <w14:srgbClr w14:val="000000">
-                                    <w14:alpha w14:val="60000"/>
-                                  </w14:srgbClr>
-                                </w14:shadow>
-                              </w:rPr>
-                              <w:t xml:space="preserve">  3: </w:t>
-                            </w:r>
-                            <w:r>
-                              <w:rPr>
-                                <w:b/>
-                                <w:bCs/>
-                                <w:color w:val="FF0000"/>
-                                <w:sz w:val="20"/>
-                                <w:szCs w:val="20"/>
-                                <w14:shadow w14:blurRad="50800" w14:dist="38100" w14:dir="2700000" w14:sx="100000" w14:sy="100000" w14:kx="0" w14:ky="0" w14:algn="tl">
-                                  <w14:srgbClr w14:val="000000">
-                                    <w14:alpha w14:val="60000"/>
-                                  </w14:srgbClr>
-                                </w14:shadow>
-                              </w:rPr>
-                              <w:tab/>
-                            </w:r>
-                            <w:proofErr w:type="gramStart"/>
-                            <w:r>
-                              <w:rPr>
-                                <w:b/>
-                                <w:bCs/>
-                                <w:color w:val="FF0000"/>
-                                <w:sz w:val="20"/>
-                                <w:szCs w:val="20"/>
-                                <w14:shadow w14:blurRad="50800" w14:dist="38100" w14:dir="2700000" w14:sx="100000" w14:sy="100000" w14:kx="0" w14:ky="0" w14:algn="tl">
-                                  <w14:srgbClr w14:val="000000">
-                                    <w14:alpha w14:val="60000"/>
-                                  </w14:srgbClr>
-                                </w14:shadow>
-                              </w:rPr>
-                              <w:t>Tail lights</w:t>
-                            </w:r>
-                            <w:proofErr w:type="gramEnd"/>
-                            <w:r>
-                              <w:rPr>
-                                <w:b/>
-                                <w:bCs/>
-                                <w:color w:val="FF0000"/>
-                                <w:sz w:val="20"/>
-                                <w:szCs w:val="20"/>
-                                <w14:shadow w14:blurRad="50800" w14:dist="38100" w14:dir="2700000" w14:sx="100000" w14:sy="100000" w14:kx="0" w14:ky="0" w14:algn="tl">
-                                  <w14:srgbClr w14:val="000000">
-                                    <w14:alpha w14:val="60000"/>
-                                  </w14:srgbClr>
-                                </w14:shadow>
-                              </w:rPr>
-                              <w:t xml:space="preserve"> (LR)</w:t>
-                            </w:r>
-                          </w:p>
-                          <w:p>
-                            <w:pPr>
-                              <w:spacing w:after="0" w:line="180" w:lineRule="auto"/>
-                            </w:pPr>
-                            <w:r>
-                              <w:rPr>
-                                <w:b/>
-                                <w:bCs/>
-                                <w:color w:val="FF0000"/>
-                                <w:sz w:val="20"/>
-                                <w:szCs w:val="20"/>
-                                <w14:shadow w14:blurRad="50800" w14:dist="38100" w14:dir="2700000" w14:sx="100000" w14:sy="100000" w14:kx="0" w14:ky="0" w14:algn="tl">
-                                  <w14:srgbClr w14:val="000000">
-                                    <w14:alpha w14:val="60000"/>
-                                  </w14:srgbClr>
-                                </w14:shadow>
-                              </w:rPr>
-                              <w:t xml:space="preserve">  HI: </w:t>
-                            </w:r>
-                            <w:r>
-                              <w:rPr>
-                                <w:b/>
-                                <w:bCs/>
-                                <w:color w:val="FF0000"/>
-                                <w:sz w:val="20"/>
-                                <w:szCs w:val="20"/>
-                                <w14:shadow w14:blurRad="50800" w14:dist="38100" w14:dir="2700000" w14:sx="100000" w14:sy="100000" w14:kx="0" w14:ky="0" w14:algn="tl">
-                                  <w14:srgbClr w14:val="000000">
-                                    <w14:alpha w14:val="60000"/>
-                                  </w14:srgbClr>
-                                </w14:shadow>
-                              </w:rPr>
-                              <w:tab/>
-                            </w:r>
-                            <w:r>
-                              <w:rPr>
-                                <w:b/>
-                                <w:bCs/>
-                                <w:color w:val="FF0000"/>
-                                <w:sz w:val="20"/>
-                                <w:szCs w:val="20"/>
-                                <w14:shadow w14:blurRad="50800" w14:dist="38100" w14:dir="2700000" w14:sx="100000" w14:sy="100000" w14:kx="0" w14:ky="0" w14:algn="tl">
-                                  <w14:srgbClr w14:val="000000">
-                                    <w14:alpha w14:val="60000"/>
-                                  </w14:srgbClr>
-                                </w14:shadow>
-                              </w:rPr>
-                              <w:t>Emergency</w:t>
-                            </w:r>
-                          </w:p>
-                        </w:txbxContent>
-                      </v:textbox>
-                    </v:rect>
-                  </w:pict>
-                </mc:Fallback>
-              </mc:AlternateContent>
-            </w:r>
-            <w:r>
-              <w:rPr>
-                <w:noProof/>
-                <w:color w:val="FFFFFF" w:themeColor="background1"/>
-                <w:sz w:val="32"/>
-                <w:szCs w:val="32"/>
-              </w:rPr>
-              <mc:AlternateContent>
-                <mc:Choice Requires="wps">
-                  <w:drawing>
-                    <wp:anchor distT="0" distB="0" distL="114300" distR="114300" simplePos="0" relativeHeight="251694080" behindDoc="0" locked="0" layoutInCell="1" allowOverlap="1" wp14:anchorId="2EAC73DA" wp14:editId="055F946C">
+                    <wp:anchor distT="0" distB="0" distL="114300" distR="114300" simplePos="0" relativeHeight="251693056" behindDoc="0" locked="0" layoutInCell="1" allowOverlap="1" wp14:anchorId="2EAC73DA" wp14:editId="322FE69D">
                       <wp:simplePos x="0" y="0"/>
                       <wp:positionH relativeFrom="column">
                         <wp:posOffset>1417124</wp:posOffset>
@@ -1522,7 +826,7 @@
                 </mc:Choice>
                 <mc:Fallback>
                   <w:pict>
-                    <v:rect w14:anchorId="2EAC73DA" id="_x0000_s1028" style="position:absolute;left:0;text-align:left;margin-left:111.6pt;margin-top:391.3pt;width:38pt;height:17pt;z-index:251694080;visibility:visible;mso-wrap-style:square;mso-width-percent:0;mso-height-percent:0;mso-wrap-distance-left:9pt;mso-wrap-distance-top:0;mso-wrap-distance-right:9pt;mso-wrap-distance-bottom:0;mso-position-horizontal:absolute;mso-position-horizontal-relative:text;mso-position-vertical:absolute;mso-position-vertical-relative:text;mso-width-percent:0;mso-height-percent:0;mso-width-relative:margin;mso-height-relative:margin;v-text-anchor:middle" o:gfxdata="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" fillcolor="black" strokecolor="red" strokeweight="1pt">
+                    <v:rect w14:anchorId="2EAC73DA" id="Rectangle 1" o:spid="_x0000_s1029" style="position:absolute;left:0;text-align:left;margin-left:111.6pt;margin-top:391.3pt;width:38pt;height:17pt;z-index:251693056;visibility:visible;mso-wrap-style:square;mso-width-percent:0;mso-height-percent:0;mso-wrap-distance-left:9pt;mso-wrap-distance-top:0;mso-wrap-distance-right:9pt;mso-wrap-distance-bottom:0;mso-position-horizontal:absolute;mso-position-horizontal-relative:text;mso-position-vertical:absolute;mso-position-vertical-relative:text;mso-width-percent:0;mso-height-percent:0;mso-width-relative:margin;mso-height-relative:margin;v-text-anchor:middle" o:gfxdata="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" fillcolor="black" strokecolor="red" strokeweight="1pt">
                       <v:fill opacity="39321f"/>
                       <v:textbox inset="0,0,0,0">
                         <w:txbxContent>
@@ -1591,7 +895,7 @@
               <mc:AlternateContent>
                 <mc:Choice Requires="wps">
                   <w:drawing>
-                    <wp:anchor distT="0" distB="0" distL="114300" distR="114300" simplePos="0" relativeHeight="251682816" behindDoc="0" locked="0" layoutInCell="1" allowOverlap="1" wp14:anchorId="52C438C6" wp14:editId="11779C17">
+                    <wp:anchor distT="0" distB="0" distL="114300" distR="114300" simplePos="0" relativeHeight="251681792" behindDoc="0" locked="0" layoutInCell="1" allowOverlap="1" wp14:anchorId="52C438C6" wp14:editId="233BA5DD">
                       <wp:simplePos x="0" y="0"/>
                       <wp:positionH relativeFrom="column">
                         <wp:posOffset>2402086</wp:posOffset>
@@ -1700,7 +1004,7 @@
                 </mc:Choice>
                 <mc:Fallback>
                   <w:pict>
-                    <v:rect w14:anchorId="52C438C6" id="_x0000_s1029" style="position:absolute;left:0;text-align:left;margin-left:189.15pt;margin-top:392.75pt;width:60.25pt;height:17pt;z-index:251682816;visibility:visible;mso-wrap-style:square;mso-width-percent:0;mso-height-percent:0;mso-wrap-distance-left:9pt;mso-wrap-distance-top:0;mso-wrap-distance-right:9pt;mso-wrap-distance-bottom:0;mso-position-horizontal:absolute;mso-position-horizontal-relative:text;mso-position-vertical:absolute;mso-position-vertical-relative:text;mso-width-percent:0;mso-height-percent:0;mso-width-relative:margin;mso-height-relative:margin;v-text-anchor:middle" o:gfxdata="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" fillcolor="black" strokecolor="red" strokeweight="1pt">
+                    <v:rect w14:anchorId="52C438C6" id="_x0000_s1030" style="position:absolute;left:0;text-align:left;margin-left:189.15pt;margin-top:392.75pt;width:60.25pt;height:17pt;z-index:251681792;visibility:visible;mso-wrap-style:square;mso-width-percent:0;mso-height-percent:0;mso-wrap-distance-left:9pt;mso-wrap-distance-top:0;mso-wrap-distance-right:9pt;mso-wrap-distance-bottom:0;mso-position-horizontal:absolute;mso-position-horizontal-relative:text;mso-position-vertical:absolute;mso-position-vertical-relative:text;mso-width-percent:0;mso-height-percent:0;mso-width-relative:margin;mso-height-relative:margin;v-text-anchor:middle" o:gfxdata="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" fillcolor="black" strokecolor="red" strokeweight="1pt">
                       <v:fill opacity="39321f"/>
                       <v:textbox inset="0,0,0,0">
                         <w:txbxContent>
@@ -1754,7 +1058,7 @@
               <mc:AlternateContent>
                 <mc:Choice Requires="wps">
                   <w:drawing>
-                    <wp:anchor distT="0" distB="0" distL="114300" distR="114300" simplePos="0" relativeHeight="251689984" behindDoc="0" locked="0" layoutInCell="1" allowOverlap="1" wp14:anchorId="5011B118" wp14:editId="24BB045A">
+                    <wp:anchor distT="0" distB="0" distL="114300" distR="114300" simplePos="0" relativeHeight="251688960" behindDoc="0" locked="0" layoutInCell="1" allowOverlap="1" wp14:anchorId="5011B118" wp14:editId="5CAF0DF6">
                       <wp:simplePos x="0" y="0"/>
                       <wp:positionH relativeFrom="column">
                         <wp:posOffset>4746050</wp:posOffset>
@@ -1918,7 +1222,6 @@
                                     </w:rPr>
                                     <w:t xml:space="preserve"> </w:t>
                                   </w:r>
-                                  <w:proofErr w:type="gramStart"/>
                                   <w:r>
                                     <w:rPr>
                                       <w:b/>
@@ -1962,23 +1265,7 @@
                                         </w14:srgbClr>
                                       </w14:shadow>
                                     </w:rPr>
-                                    <w:t>R</w:t>
-                                  </w:r>
-                                  <w:proofErr w:type="gramEnd"/>
-                                  <w:r>
-                                    <w:rPr>
-                                      <w:b/>
-                                      <w:bCs/>
-                                      <w:color w:val="FF0000"/>
-                                      <w:sz w:val="20"/>
-                                      <w:szCs w:val="20"/>
-                                      <w14:shadow w14:blurRad="50800" w14:dist="38100" w14:dir="2700000" w14:sx="100000" w14:sy="100000" w14:kx="0" w14:ky="0" w14:algn="tl">
-                                        <w14:srgbClr w14:val="000000">
-                                          <w14:alpha w14:val="60000"/>
-                                        </w14:srgbClr>
-                                      </w14:shadow>
-                                    </w:rPr>
-                                    <w:t>→</w:t>
+                                    <w:t>R→</w:t>
                                   </w:r>
                                   <w:r>
                                     <w:rPr>
@@ -2018,7 +1305,7 @@
                 </mc:Choice>
                 <mc:Fallback>
                   <w:pict>
-                    <v:rect w14:anchorId="5011B118" id="_x0000_s1030" style="position:absolute;left:0;text-align:left;margin-left:373.7pt;margin-top:340.7pt;width:68.25pt;height:24.85pt;z-index:251689984;visibility:visible;mso-wrap-style:square;mso-width-percent:0;mso-height-percent:0;mso-wrap-distance-left:9pt;mso-wrap-distance-top:0;mso-wrap-distance-right:9pt;mso-wrap-distance-bottom:0;mso-position-horizontal:absolute;mso-position-horizontal-relative:text;mso-position-vertical:absolute;mso-position-vertical-relative:text;mso-width-percent:0;mso-height-percent:0;mso-width-relative:margin;mso-height-relative:margin;v-text-anchor:middle" o:gfxdata="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" fillcolor="black" strokecolor="red" strokeweight="1pt">
+                    <v:rect w14:anchorId="5011B118" id="_x0000_s1031" style="position:absolute;left:0;text-align:left;margin-left:373.7pt;margin-top:340.7pt;width:68.25pt;height:24.85pt;z-index:251688960;visibility:visible;mso-wrap-style:square;mso-width-percent:0;mso-height-percent:0;mso-wrap-distance-left:9pt;mso-wrap-distance-top:0;mso-wrap-distance-right:9pt;mso-wrap-distance-bottom:0;mso-position-horizontal:absolute;mso-position-horizontal-relative:text;mso-position-vertical:absolute;mso-position-vertical-relative:text;mso-width-percent:0;mso-height-percent:0;mso-width-relative:margin;mso-height-relative:margin;v-text-anchor:middle" o:gfxdata="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" fillcolor="black" strokecolor="red" strokeweight="1pt">
                       <v:fill opacity="39321f"/>
                       <v:textbox inset="0,0,0,0">
                         <w:txbxContent>
@@ -2132,7 +1419,6 @@
                               </w:rPr>
                               <w:t xml:space="preserve"> </w:t>
                             </w:r>
-                            <w:proofErr w:type="gramStart"/>
                             <w:r>
                               <w:rPr>
                                 <w:b/>
@@ -2176,23 +1462,7 @@
                                   </w14:srgbClr>
                                 </w14:shadow>
                               </w:rPr>
-                              <w:t>R</w:t>
-                            </w:r>
-                            <w:proofErr w:type="gramEnd"/>
-                            <w:r>
-                              <w:rPr>
-                                <w:b/>
-                                <w:bCs/>
-                                <w:color w:val="FF0000"/>
-                                <w:sz w:val="20"/>
-                                <w:szCs w:val="20"/>
-                                <w14:shadow w14:blurRad="50800" w14:dist="38100" w14:dir="2700000" w14:sx="100000" w14:sy="100000" w14:kx="0" w14:ky="0" w14:algn="tl">
-                                  <w14:srgbClr w14:val="000000">
-                                    <w14:alpha w14:val="60000"/>
-                                  </w14:srgbClr>
-                                </w14:shadow>
-                              </w:rPr>
-                              <w:t>→</w:t>
+                              <w:t>R→</w:t>
                             </w:r>
                             <w:r>
                               <w:rPr>
@@ -2227,7 +1497,7 @@
               <mc:AlternateContent>
                 <mc:Choice Requires="wps">
                   <w:drawing>
-                    <wp:anchor distT="0" distB="0" distL="114300" distR="114300" simplePos="0" relativeHeight="251698176" behindDoc="0" locked="0" layoutInCell="1" allowOverlap="1" wp14:anchorId="7B697D34" wp14:editId="6CF82C7A">
+                    <wp:anchor distT="0" distB="0" distL="114300" distR="114300" simplePos="0" relativeHeight="251697152" behindDoc="0" locked="0" layoutInCell="1" allowOverlap="1" wp14:anchorId="7B697D34" wp14:editId="319DD8B6">
                       <wp:simplePos x="0" y="0"/>
                       <wp:positionH relativeFrom="column">
                         <wp:posOffset>4552390</wp:posOffset>
@@ -2323,7 +1593,7 @@
                 </mc:Choice>
                 <mc:Fallback>
                   <w:pict>
-                    <v:rect w14:anchorId="7B697D34" id="_x0000_s1031" style="position:absolute;left:0;text-align:left;margin-left:358.45pt;margin-top:392.75pt;width:58.4pt;height:17pt;z-index:251698176;visibility:visible;mso-wrap-style:square;mso-width-percent:0;mso-height-percent:0;mso-wrap-distance-left:9pt;mso-wrap-distance-top:0;mso-wrap-distance-right:9pt;mso-wrap-distance-bottom:0;mso-position-horizontal:absolute;mso-position-horizontal-relative:text;mso-position-vertical:absolute;mso-position-vertical-relative:text;mso-width-percent:0;mso-height-percent:0;mso-width-relative:margin;mso-height-relative:margin;v-text-anchor:middle" o:gfxdata="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" fillcolor="black" strokecolor="red" strokeweight="1pt">
+                    <v:rect w14:anchorId="7B697D34" id="_x0000_s1032" style="position:absolute;left:0;text-align:left;margin-left:358.45pt;margin-top:392.75pt;width:58.4pt;height:17pt;z-index:251697152;visibility:visible;mso-wrap-style:square;mso-width-percent:0;mso-height-percent:0;mso-wrap-distance-left:9pt;mso-wrap-distance-top:0;mso-wrap-distance-right:9pt;mso-wrap-distance-bottom:0;mso-position-horizontal:absolute;mso-position-horizontal-relative:text;mso-position-vertical:absolute;mso-position-vertical-relative:text;mso-width-percent:0;mso-height-percent:0;mso-width-relative:margin;mso-height-relative:margin;v-text-anchor:middle" o:gfxdata="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" fillcolor="black" strokecolor="red" strokeweight="1pt">
                       <v:fill opacity="39321f"/>
                       <v:textbox inset="0,0,0,0">
                         <w:txbxContent>
@@ -2568,7 +1838,7 @@
                 </mc:Choice>
                 <mc:Fallback>
                   <w:pict>
-                    <v:rect w14:anchorId="6494C30F" id="_x0000_s1032" style="position:absolute;left:0;text-align:left;margin-left:328.45pt;margin-top:193.9pt;width:51.35pt;height:17pt;z-index:251756544;visibility:visible;mso-wrap-style:square;mso-width-percent:0;mso-height-percent:0;mso-wrap-distance-left:9pt;mso-wrap-distance-top:0;mso-wrap-distance-right:9pt;mso-wrap-distance-bottom:0;mso-position-horizontal:absolute;mso-position-horizontal-relative:text;mso-position-vertical:absolute;mso-position-vertical-relative:text;mso-width-percent:0;mso-height-percent:0;mso-width-relative:margin;mso-height-relative:margin;v-text-anchor:middle" o:gfxdata="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" fillcolor="black" strokecolor="red" strokeweight="1pt">
+                    <v:rect w14:anchorId="6494C30F" id="_x0000_s1033" style="position:absolute;left:0;text-align:left;margin-left:328.45pt;margin-top:193.9pt;width:51.35pt;height:17pt;z-index:251756544;visibility:visible;mso-wrap-style:square;mso-width-percent:0;mso-height-percent:0;mso-wrap-distance-left:9pt;mso-wrap-distance-top:0;mso-wrap-distance-right:9pt;mso-wrap-distance-bottom:0;mso-position-horizontal:absolute;mso-position-horizontal-relative:text;mso-position-vertical:absolute;mso-position-vertical-relative:text;mso-width-percent:0;mso-height-percent:0;mso-width-relative:margin;mso-height-relative:margin;v-text-anchor:middle" o:gfxdata="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" fillcolor="black" strokecolor="red" strokeweight="1pt">
                       <v:fill opacity="39321f"/>
                       <v:textbox inset="0,0,0,0">
                         <w:txbxContent>
@@ -3201,7 +2471,7 @@
                 </mc:Choice>
                 <mc:Fallback>
                   <w:pict>
-                    <v:rect w14:anchorId="1569A595" id="_x0000_s1033" style="position:absolute;left:0;text-align:left;margin-left:3.45pt;margin-top:94.35pt;width:77.15pt;height:140pt;z-index:251752448;visibility:visible;mso-wrap-style:square;mso-width-percent:0;mso-height-percent:0;mso-wrap-distance-left:9pt;mso-wrap-distance-top:0;mso-wrap-distance-right:9pt;mso-wrap-distance-bottom:0;mso-position-horizontal:absolute;mso-position-horizontal-relative:text;mso-position-vertical:absolute;mso-position-vertical-relative:text;mso-width-percent:0;mso-height-percent:0;mso-width-relative:margin;mso-height-relative:margin;v-text-anchor:top" o:gfxdata="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" filled="f" stroked="f" strokeweight="1pt">
+                    <v:rect w14:anchorId="1569A595" id="_x0000_s1034" style="position:absolute;left:0;text-align:left;margin-left:3.45pt;margin-top:94.35pt;width:77.15pt;height:140pt;z-index:251752448;visibility:visible;mso-wrap-style:square;mso-width-percent:0;mso-height-percent:0;mso-wrap-distance-left:9pt;mso-wrap-distance-top:0;mso-wrap-distance-right:9pt;mso-wrap-distance-bottom:0;mso-position-horizontal:absolute;mso-position-horizontal-relative:text;mso-position-vertical:absolute;mso-position-vertical-relative:text;mso-width-percent:0;mso-height-percent:0;mso-width-relative:margin;mso-height-relative:margin;v-text-anchor:top" o:gfxdata="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" filled="f" stroked="f" strokeweight="1pt">
                       <v:textbox inset="0,0,0,0">
                         <w:txbxContent>
                           <w:p>
@@ -3856,7 +3126,7 @@
                 </mc:Choice>
                 <mc:Fallback>
                   <w:pict>
-                    <v:rect w14:anchorId="4112C068" id="_x0000_s1034" style="position:absolute;left:0;text-align:left;margin-left:438.75pt;margin-top:92.75pt;width:77.15pt;height:140pt;z-index:251746304;visibility:visible;mso-wrap-style:square;mso-width-percent:0;mso-height-percent:0;mso-wrap-distance-left:9pt;mso-wrap-distance-top:0;mso-wrap-distance-right:9pt;mso-wrap-distance-bottom:0;mso-position-horizontal:absolute;mso-position-horizontal-relative:text;mso-position-vertical:absolute;mso-position-vertical-relative:text;mso-width-percent:0;mso-height-percent:0;mso-width-relative:margin;mso-height-relative:margin;v-text-anchor:top" o:gfxdata="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" filled="f" stroked="f" strokeweight="1pt">
+                    <v:rect w14:anchorId="4112C068" id="_x0000_s1035" style="position:absolute;left:0;text-align:left;margin-left:438.75pt;margin-top:92.75pt;width:77.15pt;height:140pt;z-index:251746304;visibility:visible;mso-wrap-style:square;mso-width-percent:0;mso-height-percent:0;mso-wrap-distance-left:9pt;mso-wrap-distance-top:0;mso-wrap-distance-right:9pt;mso-wrap-distance-bottom:0;mso-position-horizontal:absolute;mso-position-horizontal-relative:text;mso-position-vertical:absolute;mso-position-vertical-relative:text;mso-width-percent:0;mso-height-percent:0;mso-width-relative:margin;mso-height-relative:margin;v-text-anchor:top" o:gfxdata="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" filled="f" stroked="f" strokeweight="1pt">
                       <v:textbox inset="0,0,0,0">
                         <w:txbxContent>
                           <w:p>
@@ -4452,7 +3722,7 @@
                 </mc:Choice>
                 <mc:Fallback>
                   <w:pict>
-                    <v:rect w14:anchorId="5DCB49D9" id="_x0000_s1035" style="position:absolute;left:0;text-align:left;margin-left:364pt;margin-top:129.55pt;width:59.3pt;height:28.5pt;z-index:251732992;visibility:visible;mso-wrap-style:square;mso-width-percent:0;mso-height-percent:0;mso-wrap-distance-left:9pt;mso-wrap-distance-top:0;mso-wrap-distance-right:9pt;mso-wrap-distance-bottom:0;mso-position-horizontal:absolute;mso-position-horizontal-relative:text;mso-position-vertical:absolute;mso-position-vertical-relative:text;mso-width-percent:0;mso-height-percent:0;mso-width-relative:margin;mso-height-relative:margin;v-text-anchor:middle" o:gfxdata="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" fillcolor="black" strokecolor="red" strokeweight="1pt">
+                    <v:rect w14:anchorId="5DCB49D9" id="_x0000_s1036" style="position:absolute;left:0;text-align:left;margin-left:364pt;margin-top:129.55pt;width:59.3pt;height:28.5pt;z-index:251732992;visibility:visible;mso-wrap-style:square;mso-width-percent:0;mso-height-percent:0;mso-wrap-distance-left:9pt;mso-wrap-distance-top:0;mso-wrap-distance-right:9pt;mso-wrap-distance-bottom:0;mso-position-horizontal:absolute;mso-position-horizontal-relative:text;mso-position-vertical:absolute;mso-position-vertical-relative:text;mso-width-percent:0;mso-height-percent:0;mso-width-relative:margin;mso-height-relative:margin;v-text-anchor:middle" o:gfxdata="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" fillcolor="black" strokecolor="red" strokeweight="1pt">
                       <v:fill opacity="39321f"/>
                       <v:textbox inset="0,0,0,0">
                         <w:txbxContent>
@@ -4506,7 +3776,7 @@
               <mc:AlternateContent>
                 <mc:Choice Requires="wpg">
                   <w:drawing>
-                    <wp:anchor distT="0" distB="0" distL="114300" distR="114300" simplePos="0" relativeHeight="251714560" behindDoc="0" locked="0" layoutInCell="1" allowOverlap="1" wp14:anchorId="0E037F5D" wp14:editId="31B4C470">
+                    <wp:anchor distT="0" distB="0" distL="114300" distR="114300" simplePos="0" relativeHeight="251713536" behindDoc="0" locked="0" layoutInCell="1" allowOverlap="1" wp14:anchorId="0E037F5D" wp14:editId="5B775CB6">
                       <wp:simplePos x="0" y="0"/>
                       <wp:positionH relativeFrom="column">
                         <wp:posOffset>3355340</wp:posOffset>
@@ -4647,11 +3917,11 @@
                 </mc:Choice>
                 <mc:Fallback>
                   <w:pict>
-                    <v:group w14:anchorId="0E037F5D" id="Group 2" o:spid="_x0000_s1036" style="position:absolute;left:0;text-align:left;margin-left:264.2pt;margin-top:451.55pt;width:178.45pt;height:17.6pt;z-index:251714560;mso-width-relative:margin" coordorigin=",95" coordsize="22669,2238" o:gfxdata="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">
-                      <v:oval id="_x0000_s1037" style="position:absolute;top:762;width:952;height:952;visibility:visible;mso-wrap-style:square;v-text-anchor:middle" o:gfxdata="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" fillcolor="#00b050" strokecolor="white [3212]">
+                    <v:group w14:anchorId="0E037F5D" id="Group 2" o:spid="_x0000_s1037" style="position:absolute;left:0;text-align:left;margin-left:264.2pt;margin-top:451.55pt;width:178.45pt;height:17.6pt;z-index:251713536;mso-width-relative:margin" coordorigin=",95" coordsize="22669,2238" o:gfxdata="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">
+                      <v:oval id="Oval 1" o:spid="_x0000_s1038" style="position:absolute;top:762;width:952;height:952;visibility:visible;mso-wrap-style:square;v-text-anchor:middle" o:gfxdata="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" fillcolor="#00b050" strokecolor="white [3212]">
                         <v:stroke joinstyle="miter"/>
                       </v:oval>
-                      <v:shape id="_x0000_s1038" type="#_x0000_t202" style="position:absolute;left:523;top:95;width:22146;height:2238;visibility:visible;mso-wrap-style:square;v-text-anchor:top" o:gfxdata="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" filled="f" stroked="f">
+                      <v:shape id="Text Box 2" o:spid="_x0000_s1039" type="#_x0000_t202" style="position:absolute;left:523;top:95;width:22146;height:2238;visibility:visible;mso-wrap-style:square;v-text-anchor:top" o:gfxdata="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" filled="f" stroked="f">
                         <v:textbox>
                           <w:txbxContent>
                             <w:p>
@@ -4705,7 +3975,7 @@
               <mc:AlternateContent>
                 <mc:Choice Requires="wps">
                   <w:drawing>
-                    <wp:anchor distT="0" distB="0" distL="114300" distR="114300" simplePos="0" relativeHeight="251667456" behindDoc="0" locked="0" layoutInCell="1" allowOverlap="1" wp14:anchorId="0B986780" wp14:editId="1D5A85F7">
+                    <wp:anchor distT="0" distB="0" distL="114300" distR="114300" simplePos="0" relativeHeight="251666432" behindDoc="0" locked="0" layoutInCell="1" allowOverlap="1" wp14:anchorId="0B986780" wp14:editId="1FF98079">
                       <wp:simplePos x="0" y="0"/>
                       <wp:positionH relativeFrom="column">
                         <wp:posOffset>1355725</wp:posOffset>
@@ -4814,7 +4084,7 @@
                 </mc:Choice>
                 <mc:Fallback>
                   <w:pict>
-                    <v:rect w14:anchorId="0B986780" id="_x0000_s1039" style="position:absolute;left:0;text-align:left;margin-left:106.75pt;margin-top:135.5pt;width:48.15pt;height:17pt;z-index:251667456;visibility:visible;mso-wrap-style:square;mso-width-percent:0;mso-height-percent:0;mso-wrap-distance-left:9pt;mso-wrap-distance-top:0;mso-wrap-distance-right:9pt;mso-wrap-distance-bottom:0;mso-position-horizontal:absolute;mso-position-horizontal-relative:text;mso-position-vertical:absolute;mso-position-vertical-relative:text;mso-width-percent:0;mso-height-percent:0;mso-width-relative:margin;mso-height-relative:margin;v-text-anchor:middle" o:gfxdata="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" fillcolor="black" strokecolor="red" strokeweight="1pt">
+                    <v:rect w14:anchorId="0B986780" id="_x0000_s1040" style="position:absolute;left:0;text-align:left;margin-left:106.75pt;margin-top:135.5pt;width:48.15pt;height:17pt;z-index:251666432;visibility:visible;mso-wrap-style:square;mso-width-percent:0;mso-height-percent:0;mso-wrap-distance-left:9pt;mso-wrap-distance-top:0;mso-wrap-distance-right:9pt;mso-wrap-distance-bottom:0;mso-position-horizontal:absolute;mso-position-horizontal-relative:text;mso-position-vertical:absolute;mso-position-vertical-relative:text;mso-width-percent:0;mso-height-percent:0;mso-width-relative:margin;mso-height-relative:margin;v-text-anchor:middle" o:gfxdata="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" fillcolor="black" strokecolor="red" strokeweight="1pt">
                       <v:fill opacity="39321f"/>
                       <v:textbox inset="0,0,0,0">
                         <w:txbxContent>
@@ -4868,7 +4138,7 @@
               <mc:AlternateContent>
                 <mc:Choice Requires="wps">
                   <w:drawing>
-                    <wp:anchor distT="0" distB="0" distL="114300" distR="114300" simplePos="0" relativeHeight="251669504" behindDoc="0" locked="0" layoutInCell="1" allowOverlap="1" wp14:anchorId="39CCF745" wp14:editId="34D21851">
+                    <wp:anchor distT="0" distB="0" distL="114300" distR="114300" simplePos="0" relativeHeight="251668480" behindDoc="0" locked="0" layoutInCell="1" allowOverlap="1" wp14:anchorId="39CCF745" wp14:editId="41C25FEC">
                       <wp:simplePos x="0" y="0"/>
                       <wp:positionH relativeFrom="column">
                         <wp:posOffset>2519045</wp:posOffset>
@@ -4964,7 +4234,7 @@
                 </mc:Choice>
                 <mc:Fallback>
                   <w:pict>
-                    <v:rect w14:anchorId="39CCF745" id="_x0000_s1040" style="position:absolute;left:0;text-align:left;margin-left:198.35pt;margin-top:135.5pt;width:48.15pt;height:17pt;z-index:251669504;visibility:visible;mso-wrap-style:square;mso-width-percent:0;mso-height-percent:0;mso-wrap-distance-left:9pt;mso-wrap-distance-top:0;mso-wrap-distance-right:9pt;mso-wrap-distance-bottom:0;mso-position-horizontal:absolute;mso-position-horizontal-relative:text;mso-position-vertical:absolute;mso-position-vertical-relative:text;mso-width-percent:0;mso-height-percent:0;mso-width-relative:margin;mso-height-relative:margin;v-text-anchor:middle" o:gfxdata="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" fillcolor="black" strokecolor="red" strokeweight="1pt">
+                    <v:rect w14:anchorId="39CCF745" id="_x0000_s1041" style="position:absolute;left:0;text-align:left;margin-left:198.35pt;margin-top:135.5pt;width:48.15pt;height:17pt;z-index:251668480;visibility:visible;mso-wrap-style:square;mso-width-percent:0;mso-height-percent:0;mso-wrap-distance-left:9pt;mso-wrap-distance-top:0;mso-wrap-distance-right:9pt;mso-wrap-distance-bottom:0;mso-position-horizontal:absolute;mso-position-horizontal-relative:text;mso-position-vertical:absolute;mso-position-vertical-relative:text;mso-width-percent:0;mso-height-percent:0;mso-width-relative:margin;mso-height-relative:margin;v-text-anchor:middle" o:gfxdata="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" fillcolor="black" strokecolor="red" strokeweight="1pt">
                       <v:fill opacity="39321f"/>
                       <v:textbox inset="0,0,0,0">
                         <w:txbxContent>
@@ -5018,7 +4288,7 @@
               <mc:AlternateContent>
                 <mc:Choice Requires="wps">
                   <w:drawing>
-                    <wp:anchor distT="0" distB="0" distL="114300" distR="114300" simplePos="0" relativeHeight="251671552" behindDoc="0" locked="0" layoutInCell="1" allowOverlap="1" wp14:anchorId="6F9D1902" wp14:editId="7AFBAF1E">
+                    <wp:anchor distT="0" distB="0" distL="114300" distR="114300" simplePos="0" relativeHeight="251670528" behindDoc="0" locked="0" layoutInCell="1" allowOverlap="1" wp14:anchorId="6F9D1902" wp14:editId="58E6C2E4">
                       <wp:simplePos x="0" y="0"/>
                       <wp:positionH relativeFrom="column">
                         <wp:posOffset>3558223</wp:posOffset>
@@ -5114,7 +4384,7 @@
                 </mc:Choice>
                 <mc:Fallback>
                   <w:pict>
-                    <v:rect w14:anchorId="6F9D1902" id="_x0000_s1041" style="position:absolute;left:0;text-align:left;margin-left:280.2pt;margin-top:135.5pt;width:48.15pt;height:17pt;z-index:251671552;visibility:visible;mso-wrap-style:square;mso-width-percent:0;mso-height-percent:0;mso-wrap-distance-left:9pt;mso-wrap-distance-top:0;mso-wrap-distance-right:9pt;mso-wrap-distance-bottom:0;mso-position-horizontal:absolute;mso-position-horizontal-relative:text;mso-position-vertical:absolute;mso-position-vertical-relative:text;mso-width-percent:0;mso-height-percent:0;mso-width-relative:margin;mso-height-relative:margin;v-text-anchor:middle" o:gfxdata="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" fillcolor="black" strokecolor="red" strokeweight="1pt">
+                    <v:rect w14:anchorId="6F9D1902" id="_x0000_s1042" style="position:absolute;left:0;text-align:left;margin-left:280.2pt;margin-top:135.5pt;width:48.15pt;height:17pt;z-index:251670528;visibility:visible;mso-wrap-style:square;mso-width-percent:0;mso-height-percent:0;mso-wrap-distance-left:9pt;mso-wrap-distance-top:0;mso-wrap-distance-right:9pt;mso-wrap-distance-bottom:0;mso-position-horizontal:absolute;mso-position-horizontal-relative:text;mso-position-vertical:absolute;mso-position-vertical-relative:text;mso-width-percent:0;mso-height-percent:0;mso-width-relative:margin;mso-height-relative:margin;v-text-anchor:middle" o:gfxdata="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" fillcolor="black" strokecolor="red" strokeweight="1pt">
                       <v:fill opacity="39321f"/>
                       <v:textbox inset="0,0,0,0">
                         <w:txbxContent>
@@ -5168,7 +4438,7 @@
               <mc:AlternateContent>
                 <mc:Choice Requires="wps">
                   <w:drawing>
-                    <wp:anchor distT="0" distB="0" distL="114300" distR="114300" simplePos="0" relativeHeight="251726848" behindDoc="0" locked="0" layoutInCell="1" allowOverlap="1" wp14:anchorId="0BB88696" wp14:editId="5BAE0ED4">
+                    <wp:anchor distT="0" distB="0" distL="114300" distR="114300" simplePos="0" relativeHeight="251726848" behindDoc="0" locked="0" layoutInCell="1" allowOverlap="1" wp14:anchorId="0BB88696" wp14:editId="191D0825">
                       <wp:simplePos x="0" y="0"/>
                       <wp:positionH relativeFrom="column">
                         <wp:posOffset>4895850</wp:posOffset>
@@ -5238,7 +4508,7 @@
                 </mc:Choice>
                 <mc:Fallback>
                   <w:pict>
-                    <v:oval w14:anchorId="3DE8020A" id="Oval 1" o:spid="_x0000_s1026" style="position:absolute;margin-left:385.5pt;margin-top:417.1pt;width:7.5pt;height:7.5pt;z-index:251726848;visibility:visible;mso-wrap-style:square;mso-width-percent:0;mso-height-percent:0;mso-wrap-distance-left:9pt;mso-wrap-distance-top:0;mso-wrap-distance-right:9pt;mso-wrap-distance-bottom:0;mso-position-horizontal:absolute;mso-position-horizontal-relative:text;mso-position-vertical:absolute;mso-position-vertical-relative:text;mso-width-percent:0;mso-height-percent:0;mso-width-relative:margin;mso-height-relative:margin;v-text-anchor:middle" o:gfxdata="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" fillcolor="#00b050" strokecolor="white [3212]">
+                    <v:oval w14:anchorId="3913D2A8" id="Oval 1" o:spid="_x0000_s1026" style="position:absolute;margin-left:385.5pt;margin-top:417.1pt;width:7.5pt;height:7.5pt;z-index:251726848;visibility:visible;mso-wrap-style:square;mso-width-percent:0;mso-height-percent:0;mso-wrap-distance-left:9pt;mso-wrap-distance-top:0;mso-wrap-distance-right:9pt;mso-wrap-distance-bottom:0;mso-position-horizontal:absolute;mso-position-horizontal-relative:text;mso-position-vertical:absolute;mso-position-vertical-relative:text;mso-width-percent:0;mso-height-percent:0;mso-width-relative:margin;mso-height-relative:margin;v-text-anchor:middle" o:gfxdata="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" fillcolor="#00b050" strokecolor="white [3212]">
                       <v:stroke joinstyle="miter"/>
                     </v:oval>
                   </w:pict>
@@ -5255,128 +4525,7 @@
               <mc:AlternateContent>
                 <mc:Choice Requires="wps">
                   <w:drawing>
-                    <wp:anchor distT="0" distB="0" distL="114300" distR="114300" simplePos="0" relativeHeight="251722752" behindDoc="0" locked="0" layoutInCell="1" allowOverlap="1" wp14:anchorId="0674617E" wp14:editId="14F97BFB">
-                      <wp:simplePos x="0" y="0"/>
-                      <wp:positionH relativeFrom="column">
-                        <wp:posOffset>1485900</wp:posOffset>
-                      </wp:positionH>
-                      <wp:positionV relativeFrom="paragraph">
-                        <wp:posOffset>4626928</wp:posOffset>
-                      </wp:positionV>
-                      <wp:extent cx="95250" cy="95250"/>
-                      <wp:effectExtent l="0" t="0" r="19050" b="19050"/>
-                      <wp:wrapNone/>
-                      <wp:docPr id="115945447" name="Oval 1"/>
-                      <wp:cNvGraphicFramePr/>
-                      <a:graphic xmlns:a="http://schemas.openxmlformats.org/drawingml/2006/main">
-                        <a:graphicData uri="http://schemas.microsoft.com/office/word/2010/wordprocessingShape">
-                          <wps:wsp>
-                            <wps:cNvSpPr/>
-                            <wps:spPr>
-                              <a:xfrm>
-                                <a:off x="0" y="0"/>
-                                <a:ext cx="95250" cy="95250"/>
-                              </a:xfrm>
-                              <a:prstGeom prst="ellipse">
-                                <a:avLst/>
-                              </a:prstGeom>
-                              <a:solidFill>
-                                <a:srgbClr val="00B050"/>
-                              </a:solidFill>
-                              <a:ln w="9525">
-                                <a:solidFill>
-                                  <a:schemeClr val="bg1"/>
-                                </a:solidFill>
-                              </a:ln>
-                            </wps:spPr>
-                            <wps:style>
-                              <a:lnRef idx="2">
-                                <a:schemeClr val="accent6">
-                                  <a:shade val="15000"/>
-                                </a:schemeClr>
-                              </a:lnRef>
-                              <a:fillRef idx="1">
-                                <a:schemeClr val="accent6"/>
-                              </a:fillRef>
-                              <a:effectRef idx="0">
-                                <a:schemeClr val="accent6"/>
-                              </a:effectRef>
-                              <a:fontRef idx="minor">
-                                <a:schemeClr val="lt1"/>
-                              </a:fontRef>
-                            </wps:style>
-                            <wps:txbx>
-                              <w:txbxContent>
-                                <w:p>
-                                  <w:pPr>
-                                    <w:rPr>
-                                      <w:color w:val="FFFFFF" w:themeColor="background1"/>
-                                    </w:rPr>
-                                  </w:pPr>
-                                  <w:r>
-                                    <w:rPr>
-                                      <w:color w:val="FFFFFF" w:themeColor="background1"/>
-                                    </w:rPr>
-                                    <w:t>2</w:t>
-                                  </w:r>
-                                </w:p>
-                              </w:txbxContent>
-                            </wps:txbx>
-                            <wps:bodyPr rot="0" spcFirstLastPara="0" vertOverflow="overflow" horzOverflow="overflow" vert="horz" wrap="square" lIns="91440" tIns="45720" rIns="91440" bIns="45720" numCol="1" spcCol="0" rtlCol="0" fromWordArt="0" anchor="ctr" anchorCtr="0" forceAA="0" compatLnSpc="1">
-                              <a:prstTxWarp prst="textNoShape">
-                                <a:avLst/>
-                              </a:prstTxWarp>
-                              <a:noAutofit/>
-                            </wps:bodyPr>
-                          </wps:wsp>
-                        </a:graphicData>
-                      </a:graphic>
-                      <wp14:sizeRelH relativeFrom="margin">
-                        <wp14:pctWidth>0</wp14:pctWidth>
-                      </wp14:sizeRelH>
-                      <wp14:sizeRelV relativeFrom="margin">
-                        <wp14:pctHeight>0</wp14:pctHeight>
-                      </wp14:sizeRelV>
-                    </wp:anchor>
-                  </w:drawing>
-                </mc:Choice>
-                <mc:Fallback>
-                  <w:pict>
-                    <v:oval w14:anchorId="0674617E" id="Oval 1" o:spid="_x0000_s1042" style="position:absolute;left:0;text-align:left;margin-left:117pt;margin-top:364.35pt;width:7.5pt;height:7.5pt;z-index:251722752;visibility:visible;mso-wrap-style:square;mso-width-percent:0;mso-height-percent:0;mso-wrap-distance-left:9pt;mso-wrap-distance-top:0;mso-wrap-distance-right:9pt;mso-wrap-distance-bottom:0;mso-position-horizontal:absolute;mso-position-horizontal-relative:text;mso-position-vertical:absolute;mso-position-vertical-relative:text;mso-width-percent:0;mso-height-percent:0;mso-width-relative:margin;mso-height-relative:margin;v-text-anchor:middle" o:gfxdata="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" fillcolor="#00b050" strokecolor="white [3212]">
-                      <v:stroke joinstyle="miter"/>
-                      <v:textbox>
-                        <w:txbxContent>
-                          <w:p>
-                            <w:pPr>
-                              <w:rPr>
-                                <w:color w:val="FFFFFF" w:themeColor="background1"/>
-                              </w:rPr>
-                            </w:pPr>
-                            <w:r>
-                              <w:rPr>
-                                <w:color w:val="FFFFFF" w:themeColor="background1"/>
-                              </w:rPr>
-                              <w:t>2</w:t>
-                            </w:r>
-                          </w:p>
-                        </w:txbxContent>
-                      </v:textbox>
-                    </v:oval>
-                  </w:pict>
-                </mc:Fallback>
-              </mc:AlternateContent>
-            </w:r>
-            <w:r>
-              <w:rPr>
-                <w:noProof/>
-                <w:color w:val="FFFFFF" w:themeColor="background1"/>
-                <w:sz w:val="32"/>
-                <w:szCs w:val="32"/>
-              </w:rPr>
-              <mc:AlternateContent>
-                <mc:Choice Requires="wps">
-                  <w:drawing>
-                    <wp:anchor distT="0" distB="0" distL="114300" distR="114300" simplePos="0" relativeHeight="251720704" behindDoc="0" locked="0" layoutInCell="1" allowOverlap="1" wp14:anchorId="325A0B3E" wp14:editId="7714896F">
+                    <wp:anchor distT="0" distB="0" distL="114300" distR="114300" simplePos="0" relativeHeight="251719680" behindDoc="0" locked="0" layoutInCell="1" allowOverlap="1" wp14:anchorId="325A0B3E" wp14:editId="5156A99F">
                       <wp:simplePos x="0" y="0"/>
                       <wp:positionH relativeFrom="column">
                         <wp:posOffset>3240405</wp:posOffset>
@@ -5446,7 +4595,7 @@
                 </mc:Choice>
                 <mc:Fallback>
                   <w:pict>
-                    <v:oval w14:anchorId="1D349ACF" id="Oval 1" o:spid="_x0000_s1026" style="position:absolute;margin-left:255.15pt;margin-top:379.8pt;width:7.5pt;height:7.5pt;z-index:251720704;visibility:visible;mso-wrap-style:square;mso-width-percent:0;mso-height-percent:0;mso-wrap-distance-left:9pt;mso-wrap-distance-top:0;mso-wrap-distance-right:9pt;mso-wrap-distance-bottom:0;mso-position-horizontal:absolute;mso-position-horizontal-relative:text;mso-position-vertical:absolute;mso-position-vertical-relative:text;mso-width-percent:0;mso-height-percent:0;mso-width-relative:margin;mso-height-relative:margin;v-text-anchor:middle" o:gfxdata="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" fillcolor="#00b050" strokecolor="white [3212]">
+                    <v:oval w14:anchorId="0F1862AE" id="Oval 1" o:spid="_x0000_s1026" style="position:absolute;margin-left:255.15pt;margin-top:379.8pt;width:7.5pt;height:7.5pt;z-index:251719680;visibility:visible;mso-wrap-style:square;mso-width-percent:0;mso-height-percent:0;mso-wrap-distance-left:9pt;mso-wrap-distance-top:0;mso-wrap-distance-right:9pt;mso-wrap-distance-bottom:0;mso-position-horizontal:absolute;mso-position-horizontal-relative:text;mso-position-vertical:absolute;mso-position-vertical-relative:text;mso-width-percent:0;mso-height-percent:0;mso-width-relative:margin;mso-height-relative:margin;v-text-anchor:middle" o:gfxdata="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" fillcolor="#00b050" strokecolor="white [3212]">
                       <v:stroke joinstyle="miter"/>
                     </v:oval>
                   </w:pict>
@@ -5463,7 +4612,7 @@
               <mc:AlternateContent>
                 <mc:Choice Requires="wps">
                   <w:drawing>
-                    <wp:anchor distT="0" distB="0" distL="114300" distR="114300" simplePos="0" relativeHeight="251718656" behindDoc="0" locked="0" layoutInCell="1" allowOverlap="1" wp14:anchorId="7258615A" wp14:editId="113CBA1C">
+                    <wp:anchor distT="0" distB="0" distL="114300" distR="114300" simplePos="0" relativeHeight="251717632" behindDoc="0" locked="0" layoutInCell="1" allowOverlap="1" wp14:anchorId="7258615A" wp14:editId="036EEBBF">
                       <wp:simplePos x="0" y="0"/>
                       <wp:positionH relativeFrom="column">
                         <wp:posOffset>3762692</wp:posOffset>
@@ -5533,7 +4682,7 @@
                 </mc:Choice>
                 <mc:Fallback>
                   <w:pict>
-                    <v:oval w14:anchorId="589C3E50" id="Oval 1" o:spid="_x0000_s1026" style="position:absolute;margin-left:296.25pt;margin-top:360.55pt;width:7.5pt;height:7.5pt;z-index:251718656;visibility:visible;mso-wrap-style:square;mso-width-percent:0;mso-height-percent:0;mso-wrap-distance-left:9pt;mso-wrap-distance-top:0;mso-wrap-distance-right:9pt;mso-wrap-distance-bottom:0;mso-position-horizontal:absolute;mso-position-horizontal-relative:text;mso-position-vertical:absolute;mso-position-vertical-relative:text;mso-width-percent:0;mso-height-percent:0;mso-width-relative:margin;mso-height-relative:margin;v-text-anchor:middle" o:gfxdata="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" fillcolor="#00b050" strokecolor="white [3212]">
+                    <v:oval w14:anchorId="743202C6" id="Oval 1" o:spid="_x0000_s1026" style="position:absolute;margin-left:296.25pt;margin-top:360.55pt;width:7.5pt;height:7.5pt;z-index:251717632;visibility:visible;mso-wrap-style:square;mso-width-percent:0;mso-height-percent:0;mso-wrap-distance-left:9pt;mso-wrap-distance-top:0;mso-wrap-distance-right:9pt;mso-wrap-distance-bottom:0;mso-position-horizontal:absolute;mso-position-horizontal-relative:text;mso-position-vertical:absolute;mso-position-vertical-relative:text;mso-width-percent:0;mso-height-percent:0;mso-width-relative:margin;mso-height-relative:margin;v-text-anchor:middle" o:gfxdata="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" fillcolor="#00b050" strokecolor="white [3212]">
                       <v:stroke joinstyle="miter"/>
                     </v:oval>
                   </w:pict>
@@ -5550,7 +4699,7 @@
               <mc:AlternateContent>
                 <mc:Choice Requires="wps">
                   <w:drawing>
-                    <wp:anchor distT="0" distB="0" distL="114300" distR="114300" simplePos="0" relativeHeight="251716608" behindDoc="0" locked="0" layoutInCell="1" allowOverlap="1" wp14:anchorId="70CEE8DA" wp14:editId="7EE0CD9B">
+                    <wp:anchor distT="0" distB="0" distL="114300" distR="114300" simplePos="0" relativeHeight="251715584" behindDoc="0" locked="0" layoutInCell="1" allowOverlap="1" wp14:anchorId="70CEE8DA" wp14:editId="0D2C9C25">
                       <wp:simplePos x="0" y="0"/>
                       <wp:positionH relativeFrom="column">
                         <wp:posOffset>2738120</wp:posOffset>
@@ -5620,7 +4769,7 @@
                 </mc:Choice>
                 <mc:Fallback>
                   <w:pict>
-                    <v:oval w14:anchorId="796BA1FF" id="Oval 1" o:spid="_x0000_s1026" style="position:absolute;margin-left:215.6pt;margin-top:360.45pt;width:7.5pt;height:7.5pt;z-index:251716608;visibility:visible;mso-wrap-style:square;mso-width-percent:0;mso-height-percent:0;mso-wrap-distance-left:9pt;mso-wrap-distance-top:0;mso-wrap-distance-right:9pt;mso-wrap-distance-bottom:0;mso-position-horizontal:absolute;mso-position-horizontal-relative:text;mso-position-vertical:absolute;mso-position-vertical-relative:text;mso-width-percent:0;mso-height-percent:0;mso-width-relative:margin;mso-height-relative:margin;v-text-anchor:middle" o:gfxdata="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" fillcolor="#00b050" strokecolor="white [3212]">
+                    <v:oval w14:anchorId="4E0DA12C" id="Oval 1" o:spid="_x0000_s1026" style="position:absolute;margin-left:215.6pt;margin-top:360.45pt;width:7.5pt;height:7.5pt;z-index:251715584;visibility:visible;mso-wrap-style:square;mso-width-percent:0;mso-height-percent:0;mso-wrap-distance-left:9pt;mso-wrap-distance-top:0;mso-wrap-distance-right:9pt;mso-wrap-distance-bottom:0;mso-position-horizontal:absolute;mso-position-horizontal-relative:text;mso-position-vertical:absolute;mso-position-vertical-relative:text;mso-width-percent:0;mso-height-percent:0;mso-width-relative:margin;mso-height-relative:margin;v-text-anchor:middle" o:gfxdata="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" fillcolor="#00b050" strokecolor="white [3212]">
                       <v:stroke joinstyle="miter"/>
                     </v:oval>
                   </w:pict>
@@ -5637,7 +4786,7 @@
               <mc:AlternateContent>
                 <mc:Choice Requires="wps">
                   <w:drawing>
-                    <wp:anchor distT="0" distB="0" distL="114300" distR="114300" simplePos="0" relativeHeight="251684864" behindDoc="0" locked="0" layoutInCell="1" allowOverlap="1" wp14:anchorId="5A88F8DE" wp14:editId="7DED22DF">
+                    <wp:anchor distT="0" distB="0" distL="114300" distR="114300" simplePos="0" relativeHeight="251683840" behindDoc="0" locked="0" layoutInCell="1" allowOverlap="1" wp14:anchorId="5A88F8DE" wp14:editId="4256C17D">
                       <wp:simplePos x="0" y="0"/>
                       <wp:positionH relativeFrom="column">
                         <wp:posOffset>3576320</wp:posOffset>
@@ -5761,7 +4910,7 @@
                 </mc:Choice>
                 <mc:Fallback>
                   <w:pict>
-                    <v:rect w14:anchorId="5A88F8DE" id="_x0000_s1043" style="position:absolute;left:0;text-align:left;margin-left:281.6pt;margin-top:329.7pt;width:34pt;height:25.5pt;z-index:251684864;visibility:visible;mso-wrap-style:square;mso-width-percent:0;mso-height-percent:0;mso-wrap-distance-left:9pt;mso-wrap-distance-top:0;mso-wrap-distance-right:9pt;mso-wrap-distance-bottom:0;mso-position-horizontal:absolute;mso-position-horizontal-relative:text;mso-position-vertical:absolute;mso-position-vertical-relative:text;mso-width-percent:0;mso-height-percent:0;mso-width-relative:margin;mso-height-relative:margin;v-text-anchor:middle" o:gfxdata="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" fillcolor="black" strokecolor="red" strokeweight="1pt">
+                    <v:rect w14:anchorId="5A88F8DE" id="_x0000_s1043" style="position:absolute;left:0;text-align:left;margin-left:281.6pt;margin-top:329.7pt;width:34pt;height:25.5pt;z-index:251683840;visibility:visible;mso-wrap-style:square;mso-width-percent:0;mso-height-percent:0;mso-wrap-distance-left:9pt;mso-wrap-distance-top:0;mso-wrap-distance-right:9pt;mso-wrap-distance-bottom:0;mso-position-horizontal:absolute;mso-position-horizontal-relative:text;mso-position-vertical:absolute;mso-position-vertical-relative:text;mso-width-percent:0;mso-height-percent:0;mso-width-relative:margin;mso-height-relative:margin;v-text-anchor:middle" o:gfxdata="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" fillcolor="black" strokecolor="red" strokeweight="1pt">
                       <v:fill opacity="39321f"/>
                       <v:textbox inset="0,0,0,0">
                         <w:txbxContent>
@@ -5830,7 +4979,7 @@
               <mc:AlternateContent>
                 <mc:Choice Requires="wps">
                   <w:drawing>
-                    <wp:anchor distT="0" distB="0" distL="114300" distR="114300" simplePos="0" relativeHeight="251676672" behindDoc="0" locked="0" layoutInCell="1" allowOverlap="1" wp14:anchorId="71AA84E9" wp14:editId="6B4F354D">
+                    <wp:anchor distT="0" distB="0" distL="114300" distR="114300" simplePos="0" relativeHeight="251675648" behindDoc="0" locked="0" layoutInCell="1" allowOverlap="1" wp14:anchorId="71AA84E9" wp14:editId="6DB17EFA">
                       <wp:simplePos x="0" y="0"/>
                       <wp:positionH relativeFrom="column">
                         <wp:posOffset>2567305</wp:posOffset>
@@ -5954,7 +5103,7 @@
                 </mc:Choice>
                 <mc:Fallback>
                   <w:pict>
-                    <v:rect w14:anchorId="71AA84E9" id="_x0000_s1044" style="position:absolute;left:0;text-align:left;margin-left:202.15pt;margin-top:329.65pt;width:34pt;height:25.5pt;z-index:251676672;visibility:visible;mso-wrap-style:square;mso-width-percent:0;mso-height-percent:0;mso-wrap-distance-left:9pt;mso-wrap-distance-top:0;mso-wrap-distance-right:9pt;mso-wrap-distance-bottom:0;mso-position-horizontal:absolute;mso-position-horizontal-relative:text;mso-position-vertical:absolute;mso-position-vertical-relative:text;mso-width-percent:0;mso-height-percent:0;mso-width-relative:margin;mso-height-relative:margin;v-text-anchor:middle" o:gfxdata="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" fillcolor="black" strokecolor="red" strokeweight="1pt">
+                    <v:rect w14:anchorId="71AA84E9" id="_x0000_s1044" style="position:absolute;left:0;text-align:left;margin-left:202.15pt;margin-top:329.65pt;width:34pt;height:25.5pt;z-index:251675648;visibility:visible;mso-wrap-style:square;mso-width-percent:0;mso-height-percent:0;mso-wrap-distance-left:9pt;mso-wrap-distance-top:0;mso-wrap-distance-right:9pt;mso-wrap-distance-bottom:0;mso-position-horizontal:absolute;mso-position-horizontal-relative:text;mso-position-vertical:absolute;mso-position-vertical-relative:text;mso-width-percent:0;mso-height-percent:0;mso-width-relative:margin;mso-height-relative:margin;v-text-anchor:middle" o:gfxdata="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" fillcolor="black" strokecolor="red" strokeweight="1pt">
                       <v:fill opacity="39321f"/>
                       <v:textbox inset="0,0,0,0">
                         <w:txbxContent>
@@ -6023,88 +5172,7 @@
               <mc:AlternateContent>
                 <mc:Choice Requires="wps">
                   <w:drawing>
-                    <wp:anchor distT="0" distB="0" distL="114300" distR="114300" simplePos="0" relativeHeight="251709440" behindDoc="0" locked="0" layoutInCell="1" allowOverlap="1" wp14:anchorId="2AB7E50F" wp14:editId="100F3018">
-                      <wp:simplePos x="0" y="0"/>
-                      <wp:positionH relativeFrom="column">
-                        <wp:posOffset>1599565</wp:posOffset>
-                      </wp:positionH>
-                      <wp:positionV relativeFrom="paragraph">
-                        <wp:posOffset>4421187</wp:posOffset>
-                      </wp:positionV>
-                      <wp:extent cx="95250" cy="95250"/>
-                      <wp:effectExtent l="0" t="0" r="19050" b="19050"/>
-                      <wp:wrapNone/>
-                      <wp:docPr id="2012941271" name="Oval 1"/>
-                      <wp:cNvGraphicFramePr/>
-                      <a:graphic xmlns:a="http://schemas.openxmlformats.org/drawingml/2006/main">
-                        <a:graphicData uri="http://schemas.microsoft.com/office/word/2010/wordprocessingShape">
-                          <wps:wsp>
-                            <wps:cNvSpPr/>
-                            <wps:spPr>
-                              <a:xfrm>
-                                <a:off x="0" y="0"/>
-                                <a:ext cx="95250" cy="95250"/>
-                              </a:xfrm>
-                              <a:prstGeom prst="ellipse">
-                                <a:avLst/>
-                              </a:prstGeom>
-                              <a:solidFill>
-                                <a:srgbClr val="00B050"/>
-                              </a:solidFill>
-                              <a:ln w="9525">
-                                <a:solidFill>
-                                  <a:schemeClr val="bg1"/>
-                                </a:solidFill>
-                              </a:ln>
-                            </wps:spPr>
-                            <wps:style>
-                              <a:lnRef idx="2">
-                                <a:schemeClr val="accent6">
-                                  <a:shade val="15000"/>
-                                </a:schemeClr>
-                              </a:lnRef>
-                              <a:fillRef idx="1">
-                                <a:schemeClr val="accent6"/>
-                              </a:fillRef>
-                              <a:effectRef idx="0">
-                                <a:schemeClr val="accent6"/>
-                              </a:effectRef>
-                              <a:fontRef idx="minor">
-                                <a:schemeClr val="lt1"/>
-                              </a:fontRef>
-                            </wps:style>
-                            <wps:bodyPr rot="0" spcFirstLastPara="0" vertOverflow="overflow" horzOverflow="overflow" vert="horz" wrap="square" lIns="91440" tIns="45720" rIns="91440" bIns="45720" numCol="1" spcCol="0" rtlCol="0" fromWordArt="0" anchor="ctr" anchorCtr="0" forceAA="0" compatLnSpc="1">
-                              <a:prstTxWarp prst="textNoShape">
-                                <a:avLst/>
-                              </a:prstTxWarp>
-                              <a:noAutofit/>
-                            </wps:bodyPr>
-                          </wps:wsp>
-                        </a:graphicData>
-                      </a:graphic>
-                    </wp:anchor>
-                  </w:drawing>
-                </mc:Choice>
-                <mc:Fallback>
-                  <w:pict>
-                    <v:oval w14:anchorId="32AE8F61" id="Oval 1" o:spid="_x0000_s1026" style="position:absolute;margin-left:125.95pt;margin-top:348.1pt;width:7.5pt;height:7.5pt;z-index:251709440;visibility:visible;mso-wrap-style:square;mso-wrap-distance-left:9pt;mso-wrap-distance-top:0;mso-wrap-distance-right:9pt;mso-wrap-distance-bottom:0;mso-position-horizontal:absolute;mso-position-horizontal-relative:text;mso-position-vertical:absolute;mso-position-vertical-relative:text;v-text-anchor:middle" o:gfxdata="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" fillcolor="#00b050" strokecolor="white [3212]">
-                      <v:stroke joinstyle="miter"/>
-                    </v:oval>
-                  </w:pict>
-                </mc:Fallback>
-              </mc:AlternateContent>
-            </w:r>
-            <w:r>
-              <w:rPr>
-                <w:noProof/>
-                <w:color w:val="FFFFFF" w:themeColor="background1"/>
-                <w:sz w:val="32"/>
-                <w:szCs w:val="32"/>
-              </w:rPr>
-              <mc:AlternateContent>
-                <mc:Choice Requires="wps">
-                  <w:drawing>
-                    <wp:anchor distT="0" distB="0" distL="114300" distR="114300" simplePos="0" relativeHeight="251703296" behindDoc="0" locked="0" layoutInCell="1" allowOverlap="1" wp14:anchorId="760EDE77" wp14:editId="6C43C9FE">
+                    <wp:anchor distT="0" distB="0" distL="114300" distR="114300" simplePos="0" relativeHeight="251702272" behindDoc="0" locked="0" layoutInCell="1" allowOverlap="1" wp14:anchorId="760EDE77" wp14:editId="0F8F8680">
                       <wp:simplePos x="0" y="0"/>
                       <wp:positionH relativeFrom="column">
                         <wp:posOffset>3761105</wp:posOffset>
@@ -6168,7 +5236,7 @@
                 </mc:Choice>
                 <mc:Fallback>
                   <w:pict>
-                    <v:oval w14:anchorId="17E4507D" id="Oval 1" o:spid="_x0000_s1026" style="position:absolute;margin-left:296.15pt;margin-top:56pt;width:7.5pt;height:7.5pt;z-index:251703296;visibility:visible;mso-wrap-style:square;mso-wrap-distance-left:9pt;mso-wrap-distance-top:0;mso-wrap-distance-right:9pt;mso-wrap-distance-bottom:0;mso-position-horizontal:absolute;mso-position-horizontal-relative:text;mso-position-vertical:absolute;mso-position-vertical-relative:text;v-text-anchor:middle" o:gfxdata="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" fillcolor="#00b050" strokecolor="white [3212]">
+                    <v:oval w14:anchorId="05A30374" id="Oval 1" o:spid="_x0000_s1026" style="position:absolute;margin-left:296.15pt;margin-top:56pt;width:7.5pt;height:7.5pt;z-index:251702272;visibility:visible;mso-wrap-style:square;mso-wrap-distance-left:9pt;mso-wrap-distance-top:0;mso-wrap-distance-right:9pt;mso-wrap-distance-bottom:0;mso-position-horizontal:absolute;mso-position-horizontal-relative:text;mso-position-vertical:absolute;mso-position-vertical-relative:text;v-text-anchor:middle" o:gfxdata="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" fillcolor="#00b050" strokecolor="white [3212]">
                       <v:stroke joinstyle="miter"/>
                     </v:oval>
                   </w:pict>
@@ -6185,7 +5253,7 @@
               <mc:AlternateContent>
                 <mc:Choice Requires="wps">
                   <w:drawing>
-                    <wp:anchor distT="0" distB="0" distL="114300" distR="114300" simplePos="0" relativeHeight="251705344" behindDoc="0" locked="0" layoutInCell="1" allowOverlap="1" wp14:anchorId="3BA97E6A" wp14:editId="575F4B64">
+                    <wp:anchor distT="0" distB="0" distL="114300" distR="114300" simplePos="0" relativeHeight="251704320" behindDoc="0" locked="0" layoutInCell="1" allowOverlap="1" wp14:anchorId="3BA97E6A" wp14:editId="1027A1D0">
                       <wp:simplePos x="0" y="0"/>
                       <wp:positionH relativeFrom="column">
                         <wp:posOffset>2756853</wp:posOffset>
@@ -6249,7 +5317,7 @@
                 </mc:Choice>
                 <mc:Fallback>
                   <w:pict>
-                    <v:oval w14:anchorId="62E90AD3" id="Oval 1" o:spid="_x0000_s1026" style="position:absolute;margin-left:217.1pt;margin-top:241.25pt;width:7.5pt;height:7.5pt;z-index:251705344;visibility:visible;mso-wrap-style:square;mso-wrap-distance-left:9pt;mso-wrap-distance-top:0;mso-wrap-distance-right:9pt;mso-wrap-distance-bottom:0;mso-position-horizontal:absolute;mso-position-horizontal-relative:text;mso-position-vertical:absolute;mso-position-vertical-relative:text;v-text-anchor:middle" o:gfxdata="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" fillcolor="#00b050" strokecolor="white [3212]">
+                    <v:oval w14:anchorId="56441C06" id="Oval 1" o:spid="_x0000_s1026" style="position:absolute;margin-left:217.1pt;margin-top:241.25pt;width:7.5pt;height:7.5pt;z-index:251704320;visibility:visible;mso-wrap-style:square;mso-wrap-distance-left:9pt;mso-wrap-distance-top:0;mso-wrap-distance-right:9pt;mso-wrap-distance-bottom:0;mso-position-horizontal:absolute;mso-position-horizontal-relative:text;mso-position-vertical:absolute;mso-position-vertical-relative:text;v-text-anchor:middle" o:gfxdata="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" fillcolor="#00b050" strokecolor="white [3212]">
                       <v:stroke joinstyle="miter"/>
                     </v:oval>
                   </w:pict>
@@ -6266,7 +5334,7 @@
               <mc:AlternateContent>
                 <mc:Choice Requires="wps">
                   <w:drawing>
-                    <wp:anchor distT="0" distB="0" distL="114300" distR="114300" simplePos="0" relativeHeight="251692032" behindDoc="0" locked="0" layoutInCell="1" allowOverlap="1" wp14:anchorId="01FDE6F4" wp14:editId="26D5E376">
+                    <wp:anchor distT="0" distB="0" distL="114300" distR="114300" simplePos="0" relativeHeight="251691008" behindDoc="0" locked="0" layoutInCell="1" allowOverlap="1" wp14:anchorId="01FDE6F4" wp14:editId="42B777A0">
                       <wp:simplePos x="0" y="0"/>
                       <wp:positionH relativeFrom="column">
                         <wp:posOffset>1313612</wp:posOffset>
@@ -6390,7 +5458,7 @@
                 </mc:Choice>
                 <mc:Fallback>
                   <w:pict>
-                    <v:rect w14:anchorId="01FDE6F4" id="_x0000_s1045" style="position:absolute;left:0;text-align:left;margin-left:103.45pt;margin-top:319.2pt;width:52pt;height:25.5pt;z-index:251692032;visibility:visible;mso-wrap-style:square;mso-width-percent:0;mso-height-percent:0;mso-wrap-distance-left:9pt;mso-wrap-distance-top:0;mso-wrap-distance-right:9pt;mso-wrap-distance-bottom:0;mso-position-horizontal:absolute;mso-position-horizontal-relative:text;mso-position-vertical:absolute;mso-position-vertical-relative:text;mso-width-percent:0;mso-height-percent:0;mso-width-relative:margin;mso-height-relative:margin;v-text-anchor:middle" o:gfxdata="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" fillcolor="black" strokecolor="red" strokeweight="1pt">
+                    <v:rect w14:anchorId="01FDE6F4" id="_x0000_s1045" style="position:absolute;left:0;text-align:left;margin-left:103.45pt;margin-top:319.2pt;width:52pt;height:25.5pt;z-index:251691008;visibility:visible;mso-wrap-style:square;mso-width-percent:0;mso-height-percent:0;mso-wrap-distance-left:9pt;mso-wrap-distance-top:0;mso-wrap-distance-right:9pt;mso-wrap-distance-bottom:0;mso-position-horizontal:absolute;mso-position-horizontal-relative:text;mso-position-vertical:absolute;mso-position-vertical-relative:text;mso-width-percent:0;mso-height-percent:0;mso-width-relative:margin;mso-height-relative:margin;v-text-anchor:middle" o:gfxdata="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" fillcolor="black" strokecolor="red" strokeweight="1pt">
                       <v:fill opacity="39321f"/>
                       <v:textbox inset="0,0,0,0">
                         <w:txbxContent>
@@ -6459,7 +5527,7 @@
               <mc:AlternateContent>
                 <mc:Choice Requires="wps">
                   <w:drawing>
-                    <wp:anchor distT="0" distB="0" distL="114300" distR="114300" simplePos="0" relativeHeight="251674624" behindDoc="0" locked="0" layoutInCell="1" allowOverlap="1" wp14:anchorId="62E3AE57" wp14:editId="7977283A">
+                    <wp:anchor distT="0" distB="0" distL="114300" distR="114300" simplePos="0" relativeHeight="251673600" behindDoc="0" locked="0" layoutInCell="1" allowOverlap="1" wp14:anchorId="62E3AE57" wp14:editId="5DF07B27">
                       <wp:simplePos x="0" y="0"/>
                       <wp:positionH relativeFrom="column">
                         <wp:posOffset>2127885</wp:posOffset>
@@ -6520,7 +5588,11 @@
                 </mc:Choice>
                 <mc:Fallback>
                   <w:pict>
-                    <v:shape w14:anchorId="4D1A8CAF" id="Straight Arrow Connector 2" o:spid="_x0000_s1026" type="#_x0000_t32" style="position:absolute;margin-left:167.55pt;margin-top:144.25pt;width:15.95pt;height:49.65pt;flip:y;z-index:251674624;visibility:visible;mso-wrap-style:square;mso-width-percent:0;mso-height-percent:0;mso-wrap-distance-left:9pt;mso-wrap-distance-top:0;mso-wrap-distance-right:9pt;mso-wrap-distance-bottom:0;mso-position-horizontal:absolute;mso-position-horizontal-relative:text;mso-position-vertical:absolute;mso-position-vertical-relative:text;mso-width-percent:0;mso-height-percent:0;mso-width-relative:margin;mso-height-relative:margin" o:gfxdata="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" strokecolor="red" strokeweight="1.5pt">
+                    <v:shapetype w14:anchorId="08607E37" id="_x0000_t32" coordsize="21600,21600" o:spt="32" o:oned="t" path="m,l21600,21600e" filled="f">
+                      <v:path arrowok="t" fillok="f" o:connecttype="none"/>
+                      <o:lock v:ext="edit" shapetype="t"/>
+                    </v:shapetype>
+                    <v:shape id="Straight Arrow Connector 2" o:spid="_x0000_s1026" type="#_x0000_t32" style="position:absolute;margin-left:167.55pt;margin-top:144.25pt;width:15.95pt;height:49.65pt;flip:y;z-index:251673600;visibility:visible;mso-wrap-style:square;mso-width-percent:0;mso-height-percent:0;mso-wrap-distance-left:9pt;mso-wrap-distance-top:0;mso-wrap-distance-right:9pt;mso-wrap-distance-bottom:0;mso-position-horizontal:absolute;mso-position-horizontal-relative:text;mso-position-vertical:absolute;mso-position-vertical-relative:text;mso-width-percent:0;mso-height-percent:0;mso-width-relative:margin;mso-height-relative:margin" o:gfxdata="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" strokecolor="red" strokeweight="1.5pt">
                       <v:stroke endarrow="block" joinstyle="miter"/>
                     </v:shape>
                   </w:pict>
@@ -6537,7 +5609,7 @@
               <mc:AlternateContent>
                 <mc:Choice Requires="wps">
                   <w:drawing>
-                    <wp:anchor distT="0" distB="0" distL="114300" distR="114300" simplePos="0" relativeHeight="251673600" behindDoc="0" locked="0" layoutInCell="1" allowOverlap="1" wp14:anchorId="30B8046B" wp14:editId="247A0DFB">
+                    <wp:anchor distT="0" distB="0" distL="114300" distR="114300" simplePos="0" relativeHeight="251672576" behindDoc="0" locked="0" layoutInCell="1" allowOverlap="1" wp14:anchorId="30B8046B" wp14:editId="27CF7CB9">
                       <wp:simplePos x="0" y="0"/>
                       <wp:positionH relativeFrom="column">
                         <wp:posOffset>1824990</wp:posOffset>
@@ -6646,7 +5718,7 @@
                 </mc:Choice>
                 <mc:Fallback>
                   <w:pict>
-                    <v:rect w14:anchorId="30B8046B" id="_x0000_s1046" style="position:absolute;left:0;text-align:left;margin-left:143.7pt;margin-top:194.05pt;width:48.15pt;height:17pt;z-index:251673600;visibility:visible;mso-wrap-style:square;mso-width-percent:0;mso-height-percent:0;mso-wrap-distance-left:9pt;mso-wrap-distance-top:0;mso-wrap-distance-right:9pt;mso-wrap-distance-bottom:0;mso-position-horizontal:absolute;mso-position-horizontal-relative:text;mso-position-vertical:absolute;mso-position-vertical-relative:text;mso-width-percent:0;mso-height-percent:0;mso-width-relative:margin;mso-height-relative:margin;v-text-anchor:middle" o:gfxdata="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" fillcolor="black" strokecolor="red" strokeweight="1pt">
+                    <v:rect w14:anchorId="30B8046B" id="_x0000_s1046" style="position:absolute;left:0;text-align:left;margin-left:143.7pt;margin-top:194.05pt;width:48.15pt;height:17pt;z-index:251672576;visibility:visible;mso-wrap-style:square;mso-width-percent:0;mso-height-percent:0;mso-wrap-distance-left:9pt;mso-wrap-distance-top:0;mso-wrap-distance-right:9pt;mso-wrap-distance-bottom:0;mso-position-horizontal:absolute;mso-position-horizontal-relative:text;mso-position-vertical:absolute;mso-position-vertical-relative:text;mso-width-percent:0;mso-height-percent:0;mso-width-relative:margin;mso-height-relative:margin;v-text-anchor:middle" o:gfxdata="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" fillcolor="black" strokecolor="red" strokeweight="1pt">
                       <v:fill opacity="39321f"/>
                       <v:textbox inset="0,0,0,0">
                         <w:txbxContent>
@@ -6700,7 +5772,7 @@
               <mc:AlternateContent>
                 <mc:Choice Requires="wps">
                   <w:drawing>
-                    <wp:anchor distT="0" distB="0" distL="114300" distR="114300" simplePos="0" relativeHeight="251696128" behindDoc="0" locked="0" layoutInCell="1" allowOverlap="1" wp14:anchorId="0A5CB297" wp14:editId="29BBE1BC">
+                    <wp:anchor distT="0" distB="0" distL="114300" distR="114300" simplePos="0" relativeHeight="251695104" behindDoc="0" locked="0" layoutInCell="1" allowOverlap="1" wp14:anchorId="0A5CB297" wp14:editId="0B78BAAB">
                       <wp:simplePos x="0" y="0"/>
                       <wp:positionH relativeFrom="column">
                         <wp:posOffset>2922270</wp:posOffset>
@@ -6800,56 +5872,7 @@
                                       </w14:shadow>
                                     </w:rPr>
                                     <w:br/>
-                                    <w:t>←</w:t>
-                                  </w:r>
-                                  <w:proofErr w:type="gramStart"/>
-                                  <w:r>
-                                    <w:rPr>
-                                      <w:b/>
-                                      <w:bCs/>
-                                      <w:color w:val="FF0000"/>
-                                      <w:sz w:val="20"/>
-                                      <w:szCs w:val="20"/>
-                                      <w14:shadow w14:blurRad="50800" w14:dist="38100" w14:dir="2700000" w14:sx="100000" w14:sy="100000" w14:kx="0" w14:ky="0" w14:algn="tl">
-                                        <w14:srgbClr w14:val="000000">
-                                          <w14:alpha w14:val="60000"/>
-                                        </w14:srgbClr>
-                                      </w14:shadow>
-                                    </w:rPr>
-                                    <w:t xml:space="preserve">dec  </w:t>
-                                  </w:r>
-                                  <w:proofErr w:type="spellStart"/>
-                                  <w:r>
-                                    <w:rPr>
-                                      <w:b/>
-                                      <w:bCs/>
-                                      <w:color w:val="FF0000"/>
-                                      <w:sz w:val="20"/>
-                                      <w:szCs w:val="20"/>
-                                      <w14:shadow w14:blurRad="50800" w14:dist="38100" w14:dir="2700000" w14:sx="100000" w14:sy="100000" w14:kx="0" w14:ky="0" w14:algn="tl">
-                                        <w14:srgbClr w14:val="000000">
-                                          <w14:alpha w14:val="60000"/>
-                                        </w14:srgbClr>
-                                      </w14:shadow>
-                                    </w:rPr>
-                                    <w:t>inc</w:t>
-                                  </w:r>
-                                  <w:proofErr w:type="spellEnd"/>
-                                  <w:proofErr w:type="gramEnd"/>
-                                  <w:r>
-                                    <w:rPr>
-                                      <w:b/>
-                                      <w:bCs/>
-                                      <w:color w:val="FF0000"/>
-                                      <w:sz w:val="20"/>
-                                      <w:szCs w:val="20"/>
-                                      <w14:shadow w14:blurRad="50800" w14:dist="38100" w14:dir="2700000" w14:sx="100000" w14:sy="100000" w14:kx="0" w14:ky="0" w14:algn="tl">
-                                        <w14:srgbClr w14:val="000000">
-                                          <w14:alpha w14:val="60000"/>
-                                        </w14:srgbClr>
-                                      </w14:shadow>
-                                    </w:rPr>
-                                    <w:t>→</w:t>
+                                    <w:t>←dec  inc→</w:t>
                                   </w:r>
                                 </w:p>
                               </w:txbxContent>
@@ -6874,7 +5897,7 @@
                 </mc:Choice>
                 <mc:Fallback>
                   <w:pict>
-                    <v:rect w14:anchorId="0A5CB297" id="_x0000_s1047" style="position:absolute;left:0;text-align:left;margin-left:230.1pt;margin-top:414.25pt;width:58.5pt;height:25.5pt;z-index:251696128;visibility:visible;mso-wrap-style:square;mso-width-percent:0;mso-height-percent:0;mso-wrap-distance-left:9pt;mso-wrap-distance-top:0;mso-wrap-distance-right:9pt;mso-wrap-distance-bottom:0;mso-position-horizontal:absolute;mso-position-horizontal-relative:text;mso-position-vertical:absolute;mso-position-vertical-relative:text;mso-width-percent:0;mso-height-percent:0;mso-width-relative:margin;mso-height-relative:margin;v-text-anchor:middle" o:gfxdata="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" fillcolor="black" strokecolor="red" strokeweight="1pt">
+                    <v:rect w14:anchorId="0A5CB297" id="_x0000_s1047" style="position:absolute;left:0;text-align:left;margin-left:230.1pt;margin-top:414.25pt;width:58.5pt;height:25.5pt;z-index:251695104;visibility:visible;mso-wrap-style:square;mso-width-percent:0;mso-height-percent:0;mso-wrap-distance-left:9pt;mso-wrap-distance-top:0;mso-wrap-distance-right:9pt;mso-wrap-distance-bottom:0;mso-position-horizontal:absolute;mso-position-horizontal-relative:text;mso-position-vertical:absolute;mso-position-vertical-relative:text;mso-width-percent:0;mso-height-percent:0;mso-width-relative:margin;mso-height-relative:margin;v-text-anchor:middle" o:gfxdata="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" fillcolor="black" strokecolor="red" strokeweight="1pt">
                       <v:fill opacity="39321f"/>
                       <v:textbox inset="0,0,0,0">
                         <w:txbxContent>
@@ -6924,56 +5947,7 @@
                                 </w14:shadow>
                               </w:rPr>
                               <w:br/>
-                              <w:t>←</w:t>
-                            </w:r>
-                            <w:proofErr w:type="gramStart"/>
-                            <w:r>
-                              <w:rPr>
-                                <w:b/>
-                                <w:bCs/>
-                                <w:color w:val="FF0000"/>
-                                <w:sz w:val="20"/>
-                                <w:szCs w:val="20"/>
-                                <w14:shadow w14:blurRad="50800" w14:dist="38100" w14:dir="2700000" w14:sx="100000" w14:sy="100000" w14:kx="0" w14:ky="0" w14:algn="tl">
-                                  <w14:srgbClr w14:val="000000">
-                                    <w14:alpha w14:val="60000"/>
-                                  </w14:srgbClr>
-                                </w14:shadow>
-                              </w:rPr>
-                              <w:t xml:space="preserve">dec  </w:t>
-                            </w:r>
-                            <w:proofErr w:type="spellStart"/>
-                            <w:r>
-                              <w:rPr>
-                                <w:b/>
-                                <w:bCs/>
-                                <w:color w:val="FF0000"/>
-                                <w:sz w:val="20"/>
-                                <w:szCs w:val="20"/>
-                                <w14:shadow w14:blurRad="50800" w14:dist="38100" w14:dir="2700000" w14:sx="100000" w14:sy="100000" w14:kx="0" w14:ky="0" w14:algn="tl">
-                                  <w14:srgbClr w14:val="000000">
-                                    <w14:alpha w14:val="60000"/>
-                                  </w14:srgbClr>
-                                </w14:shadow>
-                              </w:rPr>
-                              <w:t>inc</w:t>
-                            </w:r>
-                            <w:proofErr w:type="spellEnd"/>
-                            <w:proofErr w:type="gramEnd"/>
-                            <w:r>
-                              <w:rPr>
-                                <w:b/>
-                                <w:bCs/>
-                                <w:color w:val="FF0000"/>
-                                <w:sz w:val="20"/>
-                                <w:szCs w:val="20"/>
-                                <w14:shadow w14:blurRad="50800" w14:dist="38100" w14:dir="2700000" w14:sx="100000" w14:sy="100000" w14:kx="0" w14:ky="0" w14:algn="tl">
-                                  <w14:srgbClr w14:val="000000">
-                                    <w14:alpha w14:val="60000"/>
-                                  </w14:srgbClr>
-                                </w14:shadow>
-                              </w:rPr>
-                              <w:t>→</w:t>
+                              <w:t>←dec  inc→</w:t>
                             </w:r>
                           </w:p>
                         </w:txbxContent>
@@ -6993,7 +5967,7 @@
               <mc:AlternateContent>
                 <mc:Choice Requires="wps">
                   <w:drawing>
-                    <wp:anchor distT="0" distB="0" distL="114300" distR="114300" simplePos="0" relativeHeight="251686912" behindDoc="0" locked="0" layoutInCell="1" allowOverlap="1" wp14:anchorId="2CBDD507" wp14:editId="0D5FAE97">
+                    <wp:anchor distT="0" distB="0" distL="114300" distR="114300" simplePos="0" relativeHeight="251685888" behindDoc="0" locked="0" layoutInCell="1" allowOverlap="1" wp14:anchorId="2CBDD507" wp14:editId="1549A6B7">
                       <wp:simplePos x="0" y="0"/>
                       <wp:positionH relativeFrom="column">
                         <wp:posOffset>3928745</wp:posOffset>
@@ -7102,7 +6076,7 @@
                 </mc:Choice>
                 <mc:Fallback>
                   <w:pict>
-                    <v:rect w14:anchorId="2CBDD507" id="_x0000_s1048" style="position:absolute;left:0;text-align:left;margin-left:309.35pt;margin-top:287.25pt;width:59.55pt;height:17pt;z-index:251686912;visibility:visible;mso-wrap-style:square;mso-width-percent:0;mso-height-percent:0;mso-wrap-distance-left:9pt;mso-wrap-distance-top:0;mso-wrap-distance-right:9pt;mso-wrap-distance-bottom:0;mso-position-horizontal:absolute;mso-position-horizontal-relative:text;mso-position-vertical:absolute;mso-position-vertical-relative:text;mso-width-percent:0;mso-height-percent:0;mso-width-relative:margin;mso-height-relative:margin;v-text-anchor:middle" o:gfxdata="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" fillcolor="black" strokecolor="red" strokeweight="1pt">
+                    <v:rect w14:anchorId="2CBDD507" id="_x0000_s1048" style="position:absolute;left:0;text-align:left;margin-left:309.35pt;margin-top:287.25pt;width:59.55pt;height:17pt;z-index:251685888;visibility:visible;mso-wrap-style:square;mso-width-percent:0;mso-height-percent:0;mso-wrap-distance-left:9pt;mso-wrap-distance-top:0;mso-wrap-distance-right:9pt;mso-wrap-distance-bottom:0;mso-position-horizontal:absolute;mso-position-horizontal-relative:text;mso-position-vertical:absolute;mso-position-vertical-relative:text;mso-width-percent:0;mso-height-percent:0;mso-width-relative:margin;mso-height-relative:margin;v-text-anchor:middle" o:gfxdata="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" fillcolor="black" strokecolor="red" strokeweight="1pt">
                       <v:fill opacity="39321f"/>
                       <v:textbox inset="0,0,0,0">
                         <w:txbxContent>
@@ -7156,7 +6130,7 @@
               <mc:AlternateContent>
                 <mc:Choice Requires="wps">
                   <w:drawing>
-                    <wp:anchor distT="0" distB="0" distL="114300" distR="114300" simplePos="0" relativeHeight="251687936" behindDoc="0" locked="0" layoutInCell="1" allowOverlap="1" wp14:anchorId="2F3507D2" wp14:editId="2AB987C9">
+                    <wp:anchor distT="0" distB="0" distL="114300" distR="114300" simplePos="0" relativeHeight="251686912" behindDoc="0" locked="0" layoutInCell="1" allowOverlap="1" wp14:anchorId="2F3507D2" wp14:editId="458D66D7">
                       <wp:simplePos x="0" y="0"/>
                       <wp:positionH relativeFrom="column">
                         <wp:posOffset>4376420</wp:posOffset>
@@ -7217,7 +6191,7 @@
                 </mc:Choice>
                 <mc:Fallback>
                   <w:pict>
-                    <v:shape w14:anchorId="272F8CB9" id="Straight Arrow Connector 2" o:spid="_x0000_s1026" type="#_x0000_t32" style="position:absolute;margin-left:344.6pt;margin-top:304.25pt;width:25pt;height:22.75pt;z-index:251687936;visibility:visible;mso-wrap-style:square;mso-width-percent:0;mso-height-percent:0;mso-wrap-distance-left:9pt;mso-wrap-distance-top:0;mso-wrap-distance-right:9pt;mso-wrap-distance-bottom:0;mso-position-horizontal:absolute;mso-position-horizontal-relative:text;mso-position-vertical:absolute;mso-position-vertical-relative:text;mso-width-percent:0;mso-height-percent:0;mso-width-relative:margin;mso-height-relative:margin" o:gfxdata="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" strokecolor="red" strokeweight="1.5pt">
+                    <v:shape w14:anchorId="395E4C6C" id="Straight Arrow Connector 2" o:spid="_x0000_s1026" type="#_x0000_t32" style="position:absolute;margin-left:344.6pt;margin-top:304.25pt;width:25pt;height:22.75pt;z-index:251686912;visibility:visible;mso-wrap-style:square;mso-width-percent:0;mso-height-percent:0;mso-wrap-distance-left:9pt;mso-wrap-distance-top:0;mso-wrap-distance-right:9pt;mso-wrap-distance-bottom:0;mso-position-horizontal:absolute;mso-position-horizontal-relative:text;mso-position-vertical:absolute;mso-position-vertical-relative:text;mso-width-percent:0;mso-height-percent:0;mso-width-relative:margin;mso-height-relative:margin" o:gfxdata="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" strokecolor="red" strokeweight="1.5pt">
                       <v:stroke endarrow="block" joinstyle="miter"/>
                     </v:shape>
                   </w:pict>
@@ -7234,7 +6208,7 @@
               <mc:AlternateContent>
                 <mc:Choice Requires="wps">
                   <w:drawing>
-                    <wp:anchor distT="0" distB="0" distL="114300" distR="114300" simplePos="0" relativeHeight="251680768" behindDoc="0" locked="0" layoutInCell="1" allowOverlap="1" wp14:anchorId="189BDC66" wp14:editId="13366871">
+                    <wp:anchor distT="0" distB="0" distL="114300" distR="114300" simplePos="0" relativeHeight="251679744" behindDoc="0" locked="0" layoutInCell="1" allowOverlap="1" wp14:anchorId="189BDC66" wp14:editId="4D6127AB">
                       <wp:simplePos x="0" y="0"/>
                       <wp:positionH relativeFrom="column">
                         <wp:posOffset>3617595</wp:posOffset>
@@ -7343,7 +6317,7 @@
                 </mc:Choice>
                 <mc:Fallback>
                   <w:pict>
-                    <v:rect w14:anchorId="189BDC66" id="_x0000_s1049" style="position:absolute;left:0;text-align:left;margin-left:284.85pt;margin-top:385.75pt;width:48.15pt;height:25.5pt;z-index:251680768;visibility:visible;mso-wrap-style:square;mso-width-percent:0;mso-height-percent:0;mso-wrap-distance-left:9pt;mso-wrap-distance-top:0;mso-wrap-distance-right:9pt;mso-wrap-distance-bottom:0;mso-position-horizontal:absolute;mso-position-horizontal-relative:text;mso-position-vertical:absolute;mso-position-vertical-relative:text;mso-width-percent:0;mso-height-percent:0;mso-width-relative:margin;mso-height-relative:margin;v-text-anchor:middle" o:gfxdata="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" fillcolor="black" strokecolor="red" strokeweight="1pt">
+                    <v:rect w14:anchorId="189BDC66" id="_x0000_s1049" style="position:absolute;left:0;text-align:left;margin-left:284.85pt;margin-top:385.75pt;width:48.15pt;height:25.5pt;z-index:251679744;visibility:visible;mso-wrap-style:square;mso-width-percent:0;mso-height-percent:0;mso-wrap-distance-left:9pt;mso-wrap-distance-top:0;mso-wrap-distance-right:9pt;mso-wrap-distance-bottom:0;mso-position-horizontal:absolute;mso-position-horizontal-relative:text;mso-position-vertical:absolute;mso-position-vertical-relative:text;mso-width-percent:0;mso-height-percent:0;mso-width-relative:margin;mso-height-relative:margin;v-text-anchor:middle" o:gfxdata="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" fillcolor="black" strokecolor="red" strokeweight="1pt">
                       <v:fill opacity="39321f"/>
                       <v:textbox inset="0,0,0,0">
                         <w:txbxContent>
@@ -7503,6 +6477,757 @@
     <w:p>
       <w:r>
         <w:rPr>
+          <w:noProof/>
+          <w:color w:val="FFFFFF" w:themeColor="background1"/>
+          <w:sz w:val="32"/>
+          <w:szCs w:val="32"/>
+        </w:rPr>
+        <mc:AlternateContent>
+          <mc:Choice Requires="wps">
+            <w:drawing>
+              <wp:anchor distT="0" distB="0" distL="114300" distR="114300" simplePos="0" relativeHeight="251760640" behindDoc="0" locked="0" layoutInCell="1" allowOverlap="1" wp14:anchorId="37277F15" wp14:editId="6B5EBFC6">
+                <wp:simplePos x="0" y="0"/>
+                <wp:positionH relativeFrom="column">
+                  <wp:posOffset>-162364</wp:posOffset>
+                </wp:positionH>
+                <wp:positionV relativeFrom="paragraph">
+                  <wp:posOffset>-1347470</wp:posOffset>
+                </wp:positionV>
+                <wp:extent cx="1503680" cy="877570"/>
+                <wp:effectExtent l="0" t="0" r="20320" b="17780"/>
+                <wp:wrapNone/>
+                <wp:docPr id="720524358" name="Rectangle 1"/>
+                <wp:cNvGraphicFramePr/>
+                <a:graphic xmlns:a="http://schemas.openxmlformats.org/drawingml/2006/main">
+                  <a:graphicData uri="http://schemas.microsoft.com/office/word/2010/wordprocessingShape">
+                    <wps:wsp>
+                      <wps:cNvSpPr/>
+                      <wps:spPr>
+                        <a:xfrm>
+                          <a:off x="0" y="0"/>
+                          <a:ext cx="1503680" cy="877570"/>
+                        </a:xfrm>
+                        <a:prstGeom prst="rect">
+                          <a:avLst/>
+                        </a:prstGeom>
+                        <a:solidFill>
+                          <a:srgbClr val="000000">
+                            <a:alpha val="60000"/>
+                          </a:srgbClr>
+                        </a:solidFill>
+                        <a:ln w="12700">
+                          <a:solidFill>
+                            <a:srgbClr val="FF0000"/>
+                          </a:solidFill>
+                        </a:ln>
+                      </wps:spPr>
+                      <wps:style>
+                        <a:lnRef idx="2">
+                          <a:schemeClr val="accent1">
+                            <a:shade val="15000"/>
+                          </a:schemeClr>
+                        </a:lnRef>
+                        <a:fillRef idx="1">
+                          <a:schemeClr val="accent1"/>
+                        </a:fillRef>
+                        <a:effectRef idx="0">
+                          <a:schemeClr val="accent1"/>
+                        </a:effectRef>
+                        <a:fontRef idx="minor">
+                          <a:schemeClr val="lt1"/>
+                        </a:fontRef>
+                      </wps:style>
+                      <wps:txbx>
+                        <w:txbxContent>
+                          <w:p>
+                            <w:pPr>
+                              <w:spacing w:after="0" w:line="180" w:lineRule="auto"/>
+                              <w:rPr>
+                                <w:b/>
+                                <w:bCs/>
+                                <w:color w:val="FF0000"/>
+                                <w:sz w:val="20"/>
+                                <w:szCs w:val="20"/>
+                                <w14:shadow w14:blurRad="50800" w14:dist="38100" w14:dir="2700000" w14:sx="100000" w14:sy="100000" w14:kx="0" w14:ky="0" w14:algn="tl">
+                                  <w14:srgbClr w14:val="000000">
+                                    <w14:alpha w14:val="60000"/>
+                                  </w14:srgbClr>
+                                </w14:shadow>
+                              </w:rPr>
+                            </w:pPr>
+                            <w:r>
+                              <w:rPr>
+                                <w:b/>
+                                <w:bCs/>
+                                <w:color w:val="FF0000"/>
+                                <w:sz w:val="20"/>
+                                <w:szCs w:val="20"/>
+                                <w14:shadow w14:blurRad="50800" w14:dist="38100" w14:dir="2700000" w14:sx="100000" w14:sy="100000" w14:kx="0" w14:ky="0" w14:algn="tl">
+                                  <w14:srgbClr w14:val="000000">
+                                    <w14:alpha w14:val="60000"/>
+                                  </w14:srgbClr>
+                                </w14:shadow>
+                              </w:rPr>
+                              <w:t xml:space="preserve">   0:</w:t>
+                            </w:r>
+                            <w:r>
+                              <w:rPr>
+                                <w:b/>
+                                <w:bCs/>
+                                <w:color w:val="FF0000"/>
+                                <w:sz w:val="20"/>
+                                <w:szCs w:val="20"/>
+                                <w14:shadow w14:blurRad="50800" w14:dist="38100" w14:dir="2700000" w14:sx="100000" w14:sy="100000" w14:kx="0" w14:ky="0" w14:algn="tl">
+                                  <w14:srgbClr w14:val="000000">
+                                    <w14:alpha w14:val="60000"/>
+                                  </w14:srgbClr>
+                                </w14:shadow>
+                              </w:rPr>
+                              <w:tab/>
+                            </w:r>
+                            <w:r>
+                              <w:rPr>
+                                <w:b/>
+                                <w:bCs/>
+                                <w:color w:val="FF0000"/>
+                                <w:sz w:val="20"/>
+                                <w:szCs w:val="20"/>
+                                <w14:shadow w14:blurRad="50800" w14:dist="38100" w14:dir="2700000" w14:sx="100000" w14:sy="100000" w14:kx="0" w14:ky="0" w14:algn="tl">
+                                  <w14:srgbClr w14:val="000000">
+                                    <w14:alpha w14:val="60000"/>
+                                  </w14:srgbClr>
+                                </w14:shadow>
+                              </w:rPr>
+                              <w:t>-</w:t>
+                            </w:r>
+                            <w:r>
+                              <w:rPr>
+                                <w:b/>
+                                <w:bCs/>
+                                <w:color w:val="FF0000"/>
+                                <w:sz w:val="20"/>
+                                <w:szCs w:val="20"/>
+                                <w14:shadow w14:blurRad="50800" w14:dist="38100" w14:dir="2700000" w14:sx="100000" w14:sy="100000" w14:kx="0" w14:ky="0" w14:algn="tl">
+                                  <w14:srgbClr w14:val="000000">
+                                    <w14:alpha w14:val="60000"/>
+                                  </w14:srgbClr>
+                                </w14:shadow>
+                              </w:rPr>
+                              <w:br/>
+                              <w:t xml:space="preserve">  BTV: </w:t>
+                            </w:r>
+                            <w:r>
+                              <w:rPr>
+                                <w:b/>
+                                <w:bCs/>
+                                <w:color w:val="FF0000"/>
+                                <w:sz w:val="20"/>
+                                <w:szCs w:val="20"/>
+                                <w14:shadow w14:blurRad="50800" w14:dist="38100" w14:dir="2700000" w14:sx="100000" w14:sy="100000" w14:kx="0" w14:ky="0" w14:algn="tl">
+                                  <w14:srgbClr w14:val="000000">
+                                    <w14:alpha w14:val="60000"/>
+                                  </w14:srgbClr>
+                                </w14:shadow>
+                              </w:rPr>
+                              <w:tab/>
+                            </w:r>
+                            <w:r>
+                              <w:rPr>
+                                <w:b/>
+                                <w:bCs/>
+                                <w:color w:val="FF0000"/>
+                                <w:sz w:val="20"/>
+                                <w:szCs w:val="20"/>
+                                <w14:shadow w14:blurRad="50800" w14:dist="38100" w14:dir="2700000" w14:sx="100000" w14:sy="100000" w14:kx="0" w14:ky="0" w14:algn="tl">
+                                  <w14:srgbClr w14:val="000000">
+                                    <w14:alpha w14:val="60000"/>
+                                  </w14:srgbClr>
+                                </w14:shadow>
+                              </w:rPr>
+                              <w:t>Off</w:t>
+                            </w:r>
+                            <w:r>
+                              <w:rPr>
+                                <w:b/>
+                                <w:bCs/>
+                                <w:color w:val="FF0000"/>
+                                <w:sz w:val="20"/>
+                                <w:szCs w:val="20"/>
+                                <w14:shadow w14:blurRad="50800" w14:dist="38100" w14:dir="2700000" w14:sx="100000" w14:sy="100000" w14:kx="0" w14:ky="0" w14:algn="tl">
+                                  <w14:srgbClr w14:val="000000">
+                                    <w14:alpha w14:val="60000"/>
+                                  </w14:srgbClr>
+                                </w14:shadow>
+                              </w:rPr>
+                              <w:br/>
+                              <w:t xml:space="preserve">  LO: </w:t>
+                            </w:r>
+                            <w:r>
+                              <w:rPr>
+                                <w:b/>
+                                <w:bCs/>
+                                <w:color w:val="FF0000"/>
+                                <w:sz w:val="20"/>
+                                <w:szCs w:val="20"/>
+                                <w14:shadow w14:blurRad="50800" w14:dist="38100" w14:dir="2700000" w14:sx="100000" w14:sy="100000" w14:kx="0" w14:ky="0" w14:algn="tl">
+                                  <w14:srgbClr w14:val="000000">
+                                    <w14:alpha w14:val="60000"/>
+                                  </w14:srgbClr>
+                                </w14:shadow>
+                              </w:rPr>
+                              <w:tab/>
+                            </w:r>
+                            <w:r>
+                              <w:rPr>
+                                <w:b/>
+                                <w:bCs/>
+                                <w:color w:val="FF0000"/>
+                                <w:sz w:val="20"/>
+                                <w:szCs w:val="20"/>
+                                <w14:shadow w14:blurRad="50800" w14:dist="38100" w14:dir="2700000" w14:sx="100000" w14:sy="100000" w14:kx="0" w14:ky="0" w14:algn="tl">
+                                  <w14:srgbClr w14:val="000000">
+                                    <w14:alpha w14:val="60000"/>
+                                  </w14:srgbClr>
+                                </w14:shadow>
+                              </w:rPr>
+                              <w:t>Shunting (C)</w:t>
+                            </w:r>
+                            <w:r>
+                              <w:rPr>
+                                <w:b/>
+                                <w:bCs/>
+                                <w:color w:val="FF0000"/>
+                                <w:sz w:val="20"/>
+                                <w:szCs w:val="20"/>
+                                <w14:shadow w14:blurRad="50800" w14:dist="38100" w14:dir="2700000" w14:sx="100000" w14:sy="100000" w14:kx="0" w14:ky="0" w14:algn="tl">
+                                  <w14:srgbClr w14:val="000000">
+                                    <w14:alpha w14:val="60000"/>
+                                  </w14:srgbClr>
+                                </w14:shadow>
+                              </w:rPr>
+                              <w:t xml:space="preserve"> </w:t>
+                            </w:r>
+                            <w:r>
+                              <w:rPr>
+                                <w:b/>
+                                <w:bCs/>
+                                <w:color w:val="FF0000"/>
+                                <w:sz w:val="20"/>
+                                <w:szCs w:val="20"/>
+                                <w14:shadow w14:blurRad="50800" w14:dist="38100" w14:dir="2700000" w14:sx="100000" w14:sy="100000" w14:kx="0" w14:ky="0" w14:algn="tl">
+                                  <w14:srgbClr w14:val="000000">
+                                    <w14:alpha w14:val="60000"/>
+                                  </w14:srgbClr>
+                                </w14:shadow>
+                              </w:rPr>
+                              <w:br/>
+                              <w:t xml:space="preserve">  2: </w:t>
+                            </w:r>
+                            <w:r>
+                              <w:rPr>
+                                <w:b/>
+                                <w:bCs/>
+                                <w:color w:val="FF0000"/>
+                                <w:sz w:val="20"/>
+                                <w:szCs w:val="20"/>
+                                <w14:shadow w14:blurRad="50800" w14:dist="38100" w14:dir="2700000" w14:sx="100000" w14:sy="100000" w14:kx="0" w14:ky="0" w14:algn="tl">
+                                  <w14:srgbClr w14:val="000000">
+                                    <w14:alpha w14:val="60000"/>
+                                  </w14:srgbClr>
+                                </w14:shadow>
+                              </w:rPr>
+                              <w:tab/>
+                            </w:r>
+                            <w:r>
+                              <w:rPr>
+                                <w:b/>
+                                <w:bCs/>
+                                <w:color w:val="FF0000"/>
+                                <w:sz w:val="20"/>
+                                <w:szCs w:val="20"/>
+                                <w14:shadow w14:blurRad="50800" w14:dist="38100" w14:dir="2700000" w14:sx="100000" w14:sy="100000" w14:kx="0" w14:ky="0" w14:algn="tl">
+                                  <w14:srgbClr w14:val="000000">
+                                    <w14:alpha w14:val="60000"/>
+                                  </w14:srgbClr>
+                                </w14:shadow>
+                              </w:rPr>
+                              <w:t>Head lights (LRC)</w:t>
+                            </w:r>
+                          </w:p>
+                          <w:p>
+                            <w:pPr>
+                              <w:spacing w:after="0" w:line="180" w:lineRule="auto"/>
+                              <w:rPr>
+                                <w:b/>
+                                <w:bCs/>
+                                <w:color w:val="FF0000"/>
+                                <w:sz w:val="20"/>
+                                <w:szCs w:val="20"/>
+                                <w14:shadow w14:blurRad="50800" w14:dist="38100" w14:dir="2700000" w14:sx="100000" w14:sy="100000" w14:kx="0" w14:ky="0" w14:algn="tl">
+                                  <w14:srgbClr w14:val="000000">
+                                    <w14:alpha w14:val="60000"/>
+                                  </w14:srgbClr>
+                                </w14:shadow>
+                              </w:rPr>
+                            </w:pPr>
+                            <w:r>
+                              <w:rPr>
+                                <w:b/>
+                                <w:bCs/>
+                                <w:color w:val="FF0000"/>
+                                <w:sz w:val="20"/>
+                                <w:szCs w:val="20"/>
+                                <w14:shadow w14:blurRad="50800" w14:dist="38100" w14:dir="2700000" w14:sx="100000" w14:sy="100000" w14:kx="0" w14:ky="0" w14:algn="tl">
+                                  <w14:srgbClr w14:val="000000">
+                                    <w14:alpha w14:val="60000"/>
+                                  </w14:srgbClr>
+                                </w14:shadow>
+                              </w:rPr>
+                              <w:t xml:space="preserve">  3: </w:t>
+                            </w:r>
+                            <w:r>
+                              <w:rPr>
+                                <w:b/>
+                                <w:bCs/>
+                                <w:color w:val="FF0000"/>
+                                <w:sz w:val="20"/>
+                                <w:szCs w:val="20"/>
+                                <w14:shadow w14:blurRad="50800" w14:dist="38100" w14:dir="2700000" w14:sx="100000" w14:sy="100000" w14:kx="0" w14:ky="0" w14:algn="tl">
+                                  <w14:srgbClr w14:val="000000">
+                                    <w14:alpha w14:val="60000"/>
+                                  </w14:srgbClr>
+                                </w14:shadow>
+                              </w:rPr>
+                              <w:tab/>
+                            </w:r>
+                            <w:r>
+                              <w:rPr>
+                                <w:b/>
+                                <w:bCs/>
+                                <w:color w:val="FF0000"/>
+                                <w:sz w:val="20"/>
+                                <w:szCs w:val="20"/>
+                                <w14:shadow w14:blurRad="50800" w14:dist="38100" w14:dir="2700000" w14:sx="100000" w14:sy="100000" w14:kx="0" w14:ky="0" w14:algn="tl">
+                                  <w14:srgbClr w14:val="000000">
+                                    <w14:alpha w14:val="60000"/>
+                                  </w14:srgbClr>
+                                </w14:shadow>
+                              </w:rPr>
+                              <w:t>Tail lights (LR)</w:t>
+                            </w:r>
+                          </w:p>
+                          <w:p>
+                            <w:pPr>
+                              <w:spacing w:after="0" w:line="180" w:lineRule="auto"/>
+                            </w:pPr>
+                            <w:r>
+                              <w:rPr>
+                                <w:b/>
+                                <w:bCs/>
+                                <w:color w:val="FF0000"/>
+                                <w:sz w:val="20"/>
+                                <w:szCs w:val="20"/>
+                                <w14:shadow w14:blurRad="50800" w14:dist="38100" w14:dir="2700000" w14:sx="100000" w14:sy="100000" w14:kx="0" w14:ky="0" w14:algn="tl">
+                                  <w14:srgbClr w14:val="000000">
+                                    <w14:alpha w14:val="60000"/>
+                                  </w14:srgbClr>
+                                </w14:shadow>
+                              </w:rPr>
+                              <w:t xml:space="preserve">  HI: </w:t>
+                            </w:r>
+                            <w:r>
+                              <w:rPr>
+                                <w:b/>
+                                <w:bCs/>
+                                <w:color w:val="FF0000"/>
+                                <w:sz w:val="20"/>
+                                <w:szCs w:val="20"/>
+                                <w14:shadow w14:blurRad="50800" w14:dist="38100" w14:dir="2700000" w14:sx="100000" w14:sy="100000" w14:kx="0" w14:ky="0" w14:algn="tl">
+                                  <w14:srgbClr w14:val="000000">
+                                    <w14:alpha w14:val="60000"/>
+                                  </w14:srgbClr>
+                                </w14:shadow>
+                              </w:rPr>
+                              <w:tab/>
+                            </w:r>
+                            <w:r>
+                              <w:rPr>
+                                <w:b/>
+                                <w:bCs/>
+                                <w:color w:val="FF0000"/>
+                                <w:sz w:val="20"/>
+                                <w:szCs w:val="20"/>
+                                <w14:shadow w14:blurRad="50800" w14:dist="38100" w14:dir="2700000" w14:sx="100000" w14:sy="100000" w14:kx="0" w14:ky="0" w14:algn="tl">
+                                  <w14:srgbClr w14:val="000000">
+                                    <w14:alpha w14:val="60000"/>
+                                  </w14:srgbClr>
+                                </w14:shadow>
+                              </w:rPr>
+                              <w:t>Emergency</w:t>
+                            </w:r>
+                          </w:p>
+                        </w:txbxContent>
+                      </wps:txbx>
+                      <wps:bodyPr rot="0" spcFirstLastPara="0" vertOverflow="overflow" horzOverflow="overflow" vert="horz" wrap="square" lIns="0" tIns="0" rIns="0" bIns="0" numCol="1" spcCol="0" rtlCol="0" fromWordArt="0" anchor="ctr" anchorCtr="0" forceAA="0" compatLnSpc="1">
+                        <a:prstTxWarp prst="textNoShape">
+                          <a:avLst/>
+                        </a:prstTxWarp>
+                        <a:noAutofit/>
+                      </wps:bodyPr>
+                    </wps:wsp>
+                  </a:graphicData>
+                </a:graphic>
+                <wp14:sizeRelH relativeFrom="margin">
+                  <wp14:pctWidth>0</wp14:pctWidth>
+                </wp14:sizeRelH>
+                <wp14:sizeRelV relativeFrom="margin">
+                  <wp14:pctHeight>0</wp14:pctHeight>
+                </wp14:sizeRelV>
+              </wp:anchor>
+            </w:drawing>
+          </mc:Choice>
+          <mc:Fallback>
+            <w:pict>
+              <v:rect w14:anchorId="37277F15" id="_x0000_s1050" style="position:absolute;margin-left:-12.8pt;margin-top:-106.1pt;width:118.4pt;height:69.1pt;z-index:251760640;visibility:visible;mso-wrap-style:square;mso-width-percent:0;mso-height-percent:0;mso-wrap-distance-left:9pt;mso-wrap-distance-top:0;mso-wrap-distance-right:9pt;mso-wrap-distance-bottom:0;mso-position-horizontal:absolute;mso-position-horizontal-relative:text;mso-position-vertical:absolute;mso-position-vertical-relative:text;mso-width-percent:0;mso-height-percent:0;mso-width-relative:margin;mso-height-relative:margin;v-text-anchor:middle" o:gfxdata="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" fillcolor="black" strokecolor="red" strokeweight="1pt">
+                <v:fill opacity="39321f"/>
+                <v:textbox inset="0,0,0,0">
+                  <w:txbxContent>
+                    <w:p>
+                      <w:pPr>
+                        <w:spacing w:after="0" w:line="180" w:lineRule="auto"/>
+                        <w:rPr>
+                          <w:b/>
+                          <w:bCs/>
+                          <w:color w:val="FF0000"/>
+                          <w:sz w:val="20"/>
+                          <w:szCs w:val="20"/>
+                          <w14:shadow w14:blurRad="50800" w14:dist="38100" w14:dir="2700000" w14:sx="100000" w14:sy="100000" w14:kx="0" w14:ky="0" w14:algn="tl">
+                            <w14:srgbClr w14:val="000000">
+                              <w14:alpha w14:val="60000"/>
+                            </w14:srgbClr>
+                          </w14:shadow>
+                        </w:rPr>
+                      </w:pPr>
+                      <w:r>
+                        <w:rPr>
+                          <w:b/>
+                          <w:bCs/>
+                          <w:color w:val="FF0000"/>
+                          <w:sz w:val="20"/>
+                          <w:szCs w:val="20"/>
+                          <w14:shadow w14:blurRad="50800" w14:dist="38100" w14:dir="2700000" w14:sx="100000" w14:sy="100000" w14:kx="0" w14:ky="0" w14:algn="tl">
+                            <w14:srgbClr w14:val="000000">
+                              <w14:alpha w14:val="60000"/>
+                            </w14:srgbClr>
+                          </w14:shadow>
+                        </w:rPr>
+                        <w:t xml:space="preserve">   0:</w:t>
+                      </w:r>
+                      <w:r>
+                        <w:rPr>
+                          <w:b/>
+                          <w:bCs/>
+                          <w:color w:val="FF0000"/>
+                          <w:sz w:val="20"/>
+                          <w:szCs w:val="20"/>
+                          <w14:shadow w14:blurRad="50800" w14:dist="38100" w14:dir="2700000" w14:sx="100000" w14:sy="100000" w14:kx="0" w14:ky="0" w14:algn="tl">
+                            <w14:srgbClr w14:val="000000">
+                              <w14:alpha w14:val="60000"/>
+                            </w14:srgbClr>
+                          </w14:shadow>
+                        </w:rPr>
+                        <w:tab/>
+                      </w:r>
+                      <w:r>
+                        <w:rPr>
+                          <w:b/>
+                          <w:bCs/>
+                          <w:color w:val="FF0000"/>
+                          <w:sz w:val="20"/>
+                          <w:szCs w:val="20"/>
+                          <w14:shadow w14:blurRad="50800" w14:dist="38100" w14:dir="2700000" w14:sx="100000" w14:sy="100000" w14:kx="0" w14:ky="0" w14:algn="tl">
+                            <w14:srgbClr w14:val="000000">
+                              <w14:alpha w14:val="60000"/>
+                            </w14:srgbClr>
+                          </w14:shadow>
+                        </w:rPr>
+                        <w:t>-</w:t>
+                      </w:r>
+                      <w:r>
+                        <w:rPr>
+                          <w:b/>
+                          <w:bCs/>
+                          <w:color w:val="FF0000"/>
+                          <w:sz w:val="20"/>
+                          <w:szCs w:val="20"/>
+                          <w14:shadow w14:blurRad="50800" w14:dist="38100" w14:dir="2700000" w14:sx="100000" w14:sy="100000" w14:kx="0" w14:ky="0" w14:algn="tl">
+                            <w14:srgbClr w14:val="000000">
+                              <w14:alpha w14:val="60000"/>
+                            </w14:srgbClr>
+                          </w14:shadow>
+                        </w:rPr>
+                        <w:br/>
+                        <w:t xml:space="preserve">  BTV: </w:t>
+                      </w:r>
+                      <w:r>
+                        <w:rPr>
+                          <w:b/>
+                          <w:bCs/>
+                          <w:color w:val="FF0000"/>
+                          <w:sz w:val="20"/>
+                          <w:szCs w:val="20"/>
+                          <w14:shadow w14:blurRad="50800" w14:dist="38100" w14:dir="2700000" w14:sx="100000" w14:sy="100000" w14:kx="0" w14:ky="0" w14:algn="tl">
+                            <w14:srgbClr w14:val="000000">
+                              <w14:alpha w14:val="60000"/>
+                            </w14:srgbClr>
+                          </w14:shadow>
+                        </w:rPr>
+                        <w:tab/>
+                      </w:r>
+                      <w:r>
+                        <w:rPr>
+                          <w:b/>
+                          <w:bCs/>
+                          <w:color w:val="FF0000"/>
+                          <w:sz w:val="20"/>
+                          <w:szCs w:val="20"/>
+                          <w14:shadow w14:blurRad="50800" w14:dist="38100" w14:dir="2700000" w14:sx="100000" w14:sy="100000" w14:kx="0" w14:ky="0" w14:algn="tl">
+                            <w14:srgbClr w14:val="000000">
+                              <w14:alpha w14:val="60000"/>
+                            </w14:srgbClr>
+                          </w14:shadow>
+                        </w:rPr>
+                        <w:t>Off</w:t>
+                      </w:r>
+                      <w:r>
+                        <w:rPr>
+                          <w:b/>
+                          <w:bCs/>
+                          <w:color w:val="FF0000"/>
+                          <w:sz w:val="20"/>
+                          <w:szCs w:val="20"/>
+                          <w14:shadow w14:blurRad="50800" w14:dist="38100" w14:dir="2700000" w14:sx="100000" w14:sy="100000" w14:kx="0" w14:ky="0" w14:algn="tl">
+                            <w14:srgbClr w14:val="000000">
+                              <w14:alpha w14:val="60000"/>
+                            </w14:srgbClr>
+                          </w14:shadow>
+                        </w:rPr>
+                        <w:br/>
+                        <w:t xml:space="preserve">  LO: </w:t>
+                      </w:r>
+                      <w:r>
+                        <w:rPr>
+                          <w:b/>
+                          <w:bCs/>
+                          <w:color w:val="FF0000"/>
+                          <w:sz w:val="20"/>
+                          <w:szCs w:val="20"/>
+                          <w14:shadow w14:blurRad="50800" w14:dist="38100" w14:dir="2700000" w14:sx="100000" w14:sy="100000" w14:kx="0" w14:ky="0" w14:algn="tl">
+                            <w14:srgbClr w14:val="000000">
+                              <w14:alpha w14:val="60000"/>
+                            </w14:srgbClr>
+                          </w14:shadow>
+                        </w:rPr>
+                        <w:tab/>
+                      </w:r>
+                      <w:r>
+                        <w:rPr>
+                          <w:b/>
+                          <w:bCs/>
+                          <w:color w:val="FF0000"/>
+                          <w:sz w:val="20"/>
+                          <w:szCs w:val="20"/>
+                          <w14:shadow w14:blurRad="50800" w14:dist="38100" w14:dir="2700000" w14:sx="100000" w14:sy="100000" w14:kx="0" w14:ky="0" w14:algn="tl">
+                            <w14:srgbClr w14:val="000000">
+                              <w14:alpha w14:val="60000"/>
+                            </w14:srgbClr>
+                          </w14:shadow>
+                        </w:rPr>
+                        <w:t>Shunting (C)</w:t>
+                      </w:r>
+                      <w:r>
+                        <w:rPr>
+                          <w:b/>
+                          <w:bCs/>
+                          <w:color w:val="FF0000"/>
+                          <w:sz w:val="20"/>
+                          <w:szCs w:val="20"/>
+                          <w14:shadow w14:blurRad="50800" w14:dist="38100" w14:dir="2700000" w14:sx="100000" w14:sy="100000" w14:kx="0" w14:ky="0" w14:algn="tl">
+                            <w14:srgbClr w14:val="000000">
+                              <w14:alpha w14:val="60000"/>
+                            </w14:srgbClr>
+                          </w14:shadow>
+                        </w:rPr>
+                        <w:t xml:space="preserve"> </w:t>
+                      </w:r>
+                      <w:r>
+                        <w:rPr>
+                          <w:b/>
+                          <w:bCs/>
+                          <w:color w:val="FF0000"/>
+                          <w:sz w:val="20"/>
+                          <w:szCs w:val="20"/>
+                          <w14:shadow w14:blurRad="50800" w14:dist="38100" w14:dir="2700000" w14:sx="100000" w14:sy="100000" w14:kx="0" w14:ky="0" w14:algn="tl">
+                            <w14:srgbClr w14:val="000000">
+                              <w14:alpha w14:val="60000"/>
+                            </w14:srgbClr>
+                          </w14:shadow>
+                        </w:rPr>
+                        <w:br/>
+                        <w:t xml:space="preserve">  2: </w:t>
+                      </w:r>
+                      <w:r>
+                        <w:rPr>
+                          <w:b/>
+                          <w:bCs/>
+                          <w:color w:val="FF0000"/>
+                          <w:sz w:val="20"/>
+                          <w:szCs w:val="20"/>
+                          <w14:shadow w14:blurRad="50800" w14:dist="38100" w14:dir="2700000" w14:sx="100000" w14:sy="100000" w14:kx="0" w14:ky="0" w14:algn="tl">
+                            <w14:srgbClr w14:val="000000">
+                              <w14:alpha w14:val="60000"/>
+                            </w14:srgbClr>
+                          </w14:shadow>
+                        </w:rPr>
+                        <w:tab/>
+                      </w:r>
+                      <w:r>
+                        <w:rPr>
+                          <w:b/>
+                          <w:bCs/>
+                          <w:color w:val="FF0000"/>
+                          <w:sz w:val="20"/>
+                          <w:szCs w:val="20"/>
+                          <w14:shadow w14:blurRad="50800" w14:dist="38100" w14:dir="2700000" w14:sx="100000" w14:sy="100000" w14:kx="0" w14:ky="0" w14:algn="tl">
+                            <w14:srgbClr w14:val="000000">
+                              <w14:alpha w14:val="60000"/>
+                            </w14:srgbClr>
+                          </w14:shadow>
+                        </w:rPr>
+                        <w:t>Head lights (LRC)</w:t>
+                      </w:r>
+                    </w:p>
+                    <w:p>
+                      <w:pPr>
+                        <w:spacing w:after="0" w:line="180" w:lineRule="auto"/>
+                        <w:rPr>
+                          <w:b/>
+                          <w:bCs/>
+                          <w:color w:val="FF0000"/>
+                          <w:sz w:val="20"/>
+                          <w:szCs w:val="20"/>
+                          <w14:shadow w14:blurRad="50800" w14:dist="38100" w14:dir="2700000" w14:sx="100000" w14:sy="100000" w14:kx="0" w14:ky="0" w14:algn="tl">
+                            <w14:srgbClr w14:val="000000">
+                              <w14:alpha w14:val="60000"/>
+                            </w14:srgbClr>
+                          </w14:shadow>
+                        </w:rPr>
+                      </w:pPr>
+                      <w:r>
+                        <w:rPr>
+                          <w:b/>
+                          <w:bCs/>
+                          <w:color w:val="FF0000"/>
+                          <w:sz w:val="20"/>
+                          <w:szCs w:val="20"/>
+                          <w14:shadow w14:blurRad="50800" w14:dist="38100" w14:dir="2700000" w14:sx="100000" w14:sy="100000" w14:kx="0" w14:ky="0" w14:algn="tl">
+                            <w14:srgbClr w14:val="000000">
+                              <w14:alpha w14:val="60000"/>
+                            </w14:srgbClr>
+                          </w14:shadow>
+                        </w:rPr>
+                        <w:t xml:space="preserve">  3: </w:t>
+                      </w:r>
+                      <w:r>
+                        <w:rPr>
+                          <w:b/>
+                          <w:bCs/>
+                          <w:color w:val="FF0000"/>
+                          <w:sz w:val="20"/>
+                          <w:szCs w:val="20"/>
+                          <w14:shadow w14:blurRad="50800" w14:dist="38100" w14:dir="2700000" w14:sx="100000" w14:sy="100000" w14:kx="0" w14:ky="0" w14:algn="tl">
+                            <w14:srgbClr w14:val="000000">
+                              <w14:alpha w14:val="60000"/>
+                            </w14:srgbClr>
+                          </w14:shadow>
+                        </w:rPr>
+                        <w:tab/>
+                      </w:r>
+                      <w:r>
+                        <w:rPr>
+                          <w:b/>
+                          <w:bCs/>
+                          <w:color w:val="FF0000"/>
+                          <w:sz w:val="20"/>
+                          <w:szCs w:val="20"/>
+                          <w14:shadow w14:blurRad="50800" w14:dist="38100" w14:dir="2700000" w14:sx="100000" w14:sy="100000" w14:kx="0" w14:ky="0" w14:algn="tl">
+                            <w14:srgbClr w14:val="000000">
+                              <w14:alpha w14:val="60000"/>
+                            </w14:srgbClr>
+                          </w14:shadow>
+                        </w:rPr>
+                        <w:t>Tail lights (LR)</w:t>
+                      </w:r>
+                    </w:p>
+                    <w:p>
+                      <w:pPr>
+                        <w:spacing w:after="0" w:line="180" w:lineRule="auto"/>
+                      </w:pPr>
+                      <w:r>
+                        <w:rPr>
+                          <w:b/>
+                          <w:bCs/>
+                          <w:color w:val="FF0000"/>
+                          <w:sz w:val="20"/>
+                          <w:szCs w:val="20"/>
+                          <w14:shadow w14:blurRad="50800" w14:dist="38100" w14:dir="2700000" w14:sx="100000" w14:sy="100000" w14:kx="0" w14:ky="0" w14:algn="tl">
+                            <w14:srgbClr w14:val="000000">
+                              <w14:alpha w14:val="60000"/>
+                            </w14:srgbClr>
+                          </w14:shadow>
+                        </w:rPr>
+                        <w:t xml:space="preserve">  HI: </w:t>
+                      </w:r>
+                      <w:r>
+                        <w:rPr>
+                          <w:b/>
+                          <w:bCs/>
+                          <w:color w:val="FF0000"/>
+                          <w:sz w:val="20"/>
+                          <w:szCs w:val="20"/>
+                          <w14:shadow w14:blurRad="50800" w14:dist="38100" w14:dir="2700000" w14:sx="100000" w14:sy="100000" w14:kx="0" w14:ky="0" w14:algn="tl">
+                            <w14:srgbClr w14:val="000000">
+                              <w14:alpha w14:val="60000"/>
+                            </w14:srgbClr>
+                          </w14:shadow>
+                        </w:rPr>
+                        <w:tab/>
+                      </w:r>
+                      <w:r>
+                        <w:rPr>
+                          <w:b/>
+                          <w:bCs/>
+                          <w:color w:val="FF0000"/>
+                          <w:sz w:val="20"/>
+                          <w:szCs w:val="20"/>
+                          <w14:shadow w14:blurRad="50800" w14:dist="38100" w14:dir="2700000" w14:sx="100000" w14:sy="100000" w14:kx="0" w14:ky="0" w14:algn="tl">
+                            <w14:srgbClr w14:val="000000">
+                              <w14:alpha w14:val="60000"/>
+                            </w14:srgbClr>
+                          </w14:shadow>
+                        </w:rPr>
+                        <w:t>Emergency</w:t>
+                      </w:r>
+                    </w:p>
+                  </w:txbxContent>
+                </v:textbox>
+              </v:rect>
+            </w:pict>
+          </mc:Fallback>
+        </mc:AlternateContent>
+      </w:r>
+      <w:r>
+        <w:rPr>
           <w:rFonts w:ascii="Franklin Gothic Medium Cond" w:hAnsi="Franklin Gothic Medium Cond" w:cs="Aldhabi"/>
           <w:b/>
           <w:bCs/>
@@ -7591,7 +7316,7 @@
         <mc:AlternateContent>
           <mc:Choice Requires="wps">
             <w:drawing>
-              <wp:anchor distT="0" distB="0" distL="114300" distR="114300" simplePos="0" relativeHeight="251664384" behindDoc="1" locked="0" layoutInCell="1" allowOverlap="1" wp14:anchorId="32174439" wp14:editId="17406B21">
+              <wp:anchor distT="0" distB="0" distL="114300" distR="114300" simplePos="0" relativeHeight="251663360" behindDoc="1" locked="0" layoutInCell="1" allowOverlap="1" wp14:anchorId="32174439" wp14:editId="5CA0CD86">
                 <wp:simplePos x="0" y="0"/>
                 <wp:positionH relativeFrom="page">
                   <wp:align>left</wp:align>
@@ -7679,7 +7404,7 @@
           </mc:Choice>
           <mc:Fallback>
             <w:pict>
-              <v:rect w14:anchorId="037F71FE" id="Rectangle 3" o:spid="_x0000_s1026" style="position:absolute;margin-left:0;margin-top:0;width:594.95pt;height:693pt;z-index:-251652096;visibility:visible;mso-wrap-style:square;mso-width-percent:0;mso-height-percent:0;mso-wrap-distance-left:9pt;mso-wrap-distance-top:0;mso-wrap-distance-right:9pt;mso-wrap-distance-bottom:0;mso-position-horizontal:left;mso-position-horizontal-relative:page;mso-position-vertical:top;mso-position-vertical-relative:page;mso-width-percent:0;mso-height-percent:0;mso-width-relative:margin;mso-height-relative:margin;v-text-anchor:middle" o:gfxdata="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" fillcolor="#fc3" stroked="f" strokeweight="1.5pt">
+              <v:rect w14:anchorId="1ED2F936" id="Rectangle 3" o:spid="_x0000_s1026" style="position:absolute;margin-left:0;margin-top:0;width:594.95pt;height:693pt;z-index:-251653120;visibility:visible;mso-wrap-style:square;mso-width-percent:0;mso-height-percent:0;mso-wrap-distance-left:9pt;mso-wrap-distance-top:0;mso-wrap-distance-right:9pt;mso-wrap-distance-bottom:0;mso-position-horizontal:left;mso-position-horizontal-relative:page;mso-position-vertical:top;mso-position-vertical-relative:page;mso-width-percent:0;mso-height-percent:0;mso-width-relative:margin;mso-height-relative:margin;v-text-anchor:middle" o:gfxdata="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" fillcolor="#fc3" stroked="f" strokeweight="1.5pt">
                 <v:fill color2="#003082" colors="0 #fc3;7864f #fc3;9830f white;19661f white;58982f #003082;1 #003082" focus="100%" type="gradient"/>
                 <w10:wrap anchorx="page" anchory="page"/>
               </v:rect>

</xml_diff>